<commit_message>
docs: update Word report to 1000 students and embed retrained figures
</commit_message>
<xml_diff>
--- a/reports/BaoCao_DoAn_HocMay.docx
+++ b/reports/BaoCao_DoAn_HocMay.docx
@@ -1720,7 +1720,7 @@
           <w:rFonts w:ascii="Times New Roman" w:hAnsi="Times New Roman"/>
           <w:sz w:val="24"/>
         </w:rPr>
-        <w:t>Áp dụng phương pháp Cross-Validation 5-fold, tinh chỉnh siêu tham số bằng GridSearchCV và đối soát kiểm thử thực tế trên 146 sinh viên độc lập.</w:t>
+        <w:t>Áp dụng phương pháp Cross-Validation 5-fold, tinh chỉnh siêu tham số bằng GridSearchCV và đối soát kiểm thử thực tế trên 291 sinh viên độc lập.</w:t>
       </w:r>
     </w:p>
     <w:p>
@@ -1758,7 +1758,7 @@
           <w:rFonts w:ascii="Times New Roman" w:hAnsi="Times New Roman"/>
           <w:sz w:val="24"/>
         </w:rPr>
-        <w:t>Tập dữ liệu nghiên cứu: Gồm 500 sinh viên (100 quan sát từ nguồn dữ liệu thực tế kết hợp 400 quan sát sinh tổng hợp có kiểm soát phân phối chuẩn), với cấu trúc 24 cột thuộc tính chuẩn hóa.</w:t>
+        <w:t>Tập dữ liệu nghiên cứu: Gồm 1.000 sinh viên (100 quan sát từ nguồn dữ liệu thực tế kết hợp 900 quan sát sinh tổng hợp có kiểm soát phân phối chuẩn), với cấu trúc 24 cột thuộc tính chuẩn hóa.</w:t>
       </w:r>
     </w:p>
     <w:p>
@@ -1892,7 +1892,7 @@
           <w:rFonts w:ascii="Times New Roman" w:hAnsi="Times New Roman"/>
           <w:sz w:val="24"/>
         </w:rPr>
-        <w:t>Mô tả tập dữ liệu 500 sinh viên, quy trình khám phá dữ liệu (EDA), kỹ thuật tiền xử lý và xây dựng đặc trưng cho mô hình tuyến tính.</w:t>
+        <w:t>Mô tả tập dữ liệu 1.000 sinh viên, quy trình khám phá dữ liệu (EDA), kỹ thuật tiền xử lý và xây dựng đặc trưng cho mô hình tuyến tính.</w:t>
       </w:r>
     </w:p>
     <w:p>
@@ -1932,7 +1932,7 @@
           <w:rFonts w:ascii="Times New Roman" w:hAnsi="Times New Roman"/>
           <w:sz w:val="24"/>
         </w:rPr>
-        <w:t>Công bố kết quả thực nghiệm chi tiết của Linear Regression, phân tích các trọng số hồi quy, so sánh đối chứng với các mô hình khác và bảng đối soát 146 sinh viên test set.</w:t>
+        <w:t>Công bố kết quả thực nghiệm chi tiết của Linear Regression, phân tích các trọng số hồi quy, so sánh đối chứng với các mô hình khác và bảng đối soát 291 sinh viên test set.</w:t>
       </w:r>
     </w:p>
     <w:p>
@@ -2690,7 +2690,7 @@
           <w:i w:val="0"/>
           <w:sz w:val="24"/>
         </w:rPr>
-        <w:t>Tập dữ liệu sử dụng trong đề tài gồm 500 sinh viên với 24 thuộc tính, mô phỏng dữ liệu học tập 3 học kỳ. Trong đó, 100 dòng đầu tiên được lấy từ tập dữ liệu Student Performance trên Kaggle, 400 dòng còn lại được sinh tổng hợp (synthetic) theo phân phối thống kê của dữ liệu gốc bằng phương pháp multivariate normal sampling.</w:t>
+        <w:t>Tập dữ liệu sử dụng trong đề tài gồm 1.000 sinh viên với 24 thuộc tính, mô phỏng dữ liệu học tập 3 học kỳ. Trong đó, 100 dòng đầu tiên được lấy từ tập dữ liệu Student Performance trên Kaggle, 900 dòng còn lại được sinh tổng hợp (synthetic) theo phân phối thống kê của dữ liệu gốc bằng phương pháp multivariate normal sampling.</w:t>
       </w:r>
     </w:p>
     <w:p>
@@ -3742,7 +3742,7 @@
       <w:r>
         <w:drawing>
           <wp:inline xmlns:a="http://schemas.openxmlformats.org/drawingml/2006/main" xmlns:pic="http://schemas.openxmlformats.org/drawingml/2006/picture">
-            <wp:extent cx="5029200" cy="1316957"/>
+            <wp:extent cx="5029200" cy="1317547"/>
             <wp:docPr id="1" name="Picture 1"/>
             <wp:cNvGraphicFramePr>
               <a:graphicFrameLocks noChangeAspect="1"/>
@@ -3763,7 +3763,7 @@
                   <pic:spPr>
                     <a:xfrm>
                       <a:off x="0" y="0"/>
-                      <a:ext cx="5029200" cy="1316957"/>
+                      <a:ext cx="5029200" cy="1317547"/>
                     </a:xfrm>
                     <a:prstGeom prst="rect"/>
                   </pic:spPr>
@@ -3966,7 +3966,7 @@
           <w:i w:val="0"/>
           <w:sz w:val="24"/>
         </w:rPr>
-        <w:t>Hình 3.4 cho thấy phân bố xếp loại Học lực và Rèn luyện. Về Học lực, phần lớn sinh viên đạt loại Giỏi và Xuất sắc. Về Rèn luyện, loại Khá chiếm đa số. Đặc biệt, dữ liệu status_K3 rất mất cân bằng: chỉ 16/500 (3.2%) sinh viên Leave, đây là thách thức lớn cho bài toán phân loại nhị phân.</w:t>
+        <w:t>Hình 3.4 cho thấy phân bố xếp loại Học lực và Rèn luyện. Về Học lực, phần lớn sinh viên đạt loại Giỏi và Xuất sắc. Về Rèn luyện, loại Khá chiếm đa số. Đặc biệt, dữ liệu status_K3 rất mất cân bằng: chỉ 31/1000 (3.1%) sinh viên Leave, đây là thách thức lớn cho bài toán phân loại nhị phân.</w:t>
       </w:r>
     </w:p>
     <w:p>
@@ -4055,7 +4055,7 @@
           <w:i w:val="0"/>
           <w:sz w:val="24"/>
         </w:rPr>
-        <w:t>Tập dữ liệu đã được xử lý sạch từ khâu sinh dữ liệu: không có giá trị null (0 null cells trên toàn bộ 500 × 24 = 12,000 ô), không có duplicates, và tất cả giá trị nằm trong khoảng hợp lệ (GPA ∈ [0, 4], ĐRL ∈ [35, 100], v.v.).</w:t>
+        <w:t>Tập dữ liệu đã được xử lý sạch từ khâu sinh dữ liệu: không có giá trị null (0 null cells trên toàn bộ 1000 × 24 = 24,000 ô), không có duplicates, và tất cả giá trị nằm trong khoảng hợp lệ (GPA ∈ [0, 4], ĐRL ∈ [35, 100], v.v.).</w:t>
       </w:r>
     </w:p>
     <w:p>
@@ -4429,7 +4429,7 @@
           <w:rFonts w:ascii="Times New Roman" w:hAnsi="Times New Roman"/>
           <w:sz w:val="24"/>
         </w:rPr>
-        <w:t>Bước 4: Phân chia tập dữ liệu: 70% Train (338 sinh viên) và 30% Test độc lập (146 sinh viên).</w:t>
+        <w:t>Bước 4: Phân chia tập dữ liệu: 70% Train (678 sinh viên) và 30% Test độc lập (291 sinh viên).</w:t>
       </w:r>
     </w:p>
     <w:p>
@@ -4477,7 +4477,7 @@
           <w:rFonts w:ascii="Times New Roman" w:hAnsi="Times New Roman"/>
           <w:sz w:val="24"/>
         </w:rPr>
-        <w:t>Bước 8: Đánh giá, đối soát thực tế và phân tích phương trình hồi quy trên 146 sinh viên tập kiểm thử.</w:t>
+        <w:t>Bước 8: Đánh giá, đối soát thực tế và phân tích phương trình hồi quy trên 291 sinh viên tập kiểm thử.</w:t>
       </w:r>
     </w:p>
     <w:p>
@@ -4563,7 +4563,7 @@
           <w:i w:val="0"/>
           <w:sz w:val="24"/>
         </w:rPr>
-        <w:t>Tính vector giá trị dự đoán: ŷ = X × w + b, trong đó ma trận dữ liệu đã chuẩn hóa X có kích thước (338 × 23), vector trọng số w có kích thước (23,).</w:t>
+        <w:t>Tính vector giá trị dự đoán: ŷ = X × w + b, trong đó ma trận dữ liệu đã chuẩn hóa X có kích thước (678 × 23), vector trọng số w có kích thước (23,).</w:t>
       </w:r>
     </w:p>
     <w:p>
@@ -5465,7 +5465,7 @@
           <w:i w:val="0"/>
           <w:sz w:val="24"/>
         </w:rPr>
-        <w:t>Mô hình hồi quy được huấn luyện trên 484 sinh viên Active ở kỳ 3. Tập kiểm thử: 30% (146 sinh viên). Bảng 5-1 trình bày kết quả chi tiết:</w:t>
+        <w:t>Mô hình hồi quy được huấn luyện trên 969 sinh viên Active ở kỳ 3. Tập kiểm thử: 30% (291 sinh viên). Bảng 5-1 trình bày kết quả chi tiết:</w:t>
       </w:r>
     </w:p>
     <w:p>
@@ -5672,7 +5672,7 @@
                 <w:rFonts w:ascii="Times New Roman" w:hAnsi="Times New Roman"/>
                 <w:sz w:val="20"/>
               </w:rPr>
-              <w:t>0.3693</w:t>
+              <w:t>0.3507</w:t>
             </w:r>
           </w:p>
         </w:tc>
@@ -5689,7 +5689,7 @@
                 <w:rFonts w:ascii="Times New Roman" w:hAnsi="Times New Roman"/>
                 <w:sz w:val="20"/>
               </w:rPr>
-              <w:t>0.1365</w:t>
+              <w:t>0.2486</w:t>
             </w:r>
           </w:p>
         </w:tc>
@@ -5706,7 +5706,7 @@
                 <w:rFonts w:ascii="Times New Roman" w:hAnsi="Times New Roman"/>
                 <w:sz w:val="20"/>
               </w:rPr>
-              <w:t>0.2222 ± 0.1981</w:t>
+              <w:t>0.3123 ± 0.0722</w:t>
             </w:r>
           </w:p>
         </w:tc>
@@ -5723,7 +5723,7 @@
                 <w:rFonts w:ascii="Times New Roman" w:hAnsi="Times New Roman"/>
                 <w:sz w:val="20"/>
               </w:rPr>
-              <w:t>0.2147</w:t>
+              <w:t>0.2333</w:t>
             </w:r>
           </w:p>
         </w:tc>
@@ -5740,7 +5740,7 @@
                 <w:rFonts w:ascii="Times New Roman" w:hAnsi="Times New Roman"/>
                 <w:sz w:val="20"/>
               </w:rPr>
-              <w:t>0.1676</w:t>
+              <w:t>0.1744</w:t>
             </w:r>
           </w:p>
         </w:tc>
@@ -5757,7 +5757,7 @@
                 <w:rFonts w:ascii="Times New Roman" w:hAnsi="Times New Roman"/>
                 <w:sz w:val="20"/>
               </w:rPr>
-              <w:t>4.69%</w:t>
+              <w:t>5.03%</w:t>
             </w:r>
           </w:p>
         </w:tc>
@@ -5795,7 +5795,7 @@
                 <w:rFonts w:ascii="Times New Roman" w:hAnsi="Times New Roman"/>
                 <w:sz w:val="20"/>
               </w:rPr>
-              <w:t>0.3759</w:t>
+              <w:t>0.3569</w:t>
             </w:r>
           </w:p>
         </w:tc>
@@ -5813,7 +5813,7 @@
                 <w:rFonts w:ascii="Times New Roman" w:hAnsi="Times New Roman"/>
                 <w:sz w:val="20"/>
               </w:rPr>
-              <w:t>0.1900</w:t>
+              <w:t>0.2817</w:t>
             </w:r>
           </w:p>
         </w:tc>
@@ -5831,7 +5831,7 @@
                 <w:rFonts w:ascii="Times New Roman" w:hAnsi="Times New Roman"/>
                 <w:sz w:val="20"/>
               </w:rPr>
-              <w:t>0.2222 ± 0.1981</w:t>
+              <w:t>0.3123 ± 0.0722</w:t>
             </w:r>
           </w:p>
         </w:tc>
@@ -5849,7 +5849,7 @@
                 <w:rFonts w:ascii="Times New Roman" w:hAnsi="Times New Roman"/>
                 <w:sz w:val="20"/>
               </w:rPr>
-              <w:t>0.2079</w:t>
+              <w:t>0.2281</w:t>
             </w:r>
           </w:p>
         </w:tc>
@@ -5867,7 +5867,7 @@
                 <w:rFonts w:ascii="Times New Roman" w:hAnsi="Times New Roman"/>
                 <w:sz w:val="20"/>
               </w:rPr>
-              <w:t>0.1651</w:t>
+              <w:t>0.1730</w:t>
             </w:r>
           </w:p>
         </w:tc>
@@ -5885,7 +5885,7 @@
                 <w:rFonts w:ascii="Times New Roman" w:hAnsi="Times New Roman"/>
                 <w:sz w:val="20"/>
               </w:rPr>
-              <w:t>4.63%</w:t>
+              <w:t>4.97%</w:t>
             </w:r>
           </w:p>
         </w:tc>
@@ -5921,7 +5921,7 @@
                 <w:rFonts w:ascii="Times New Roman" w:hAnsi="Times New Roman"/>
                 <w:sz w:val="20"/>
               </w:rPr>
-              <w:t>0.3667</w:t>
+              <w:t>0.3521</w:t>
             </w:r>
           </w:p>
         </w:tc>
@@ -5938,7 +5938,7 @@
                 <w:rFonts w:ascii="Times New Roman" w:hAnsi="Times New Roman"/>
                 <w:sz w:val="20"/>
               </w:rPr>
-              <w:t>0.1471</w:t>
+              <w:t>0.2603</w:t>
             </w:r>
           </w:p>
         </w:tc>
@@ -5955,7 +5955,7 @@
                 <w:rFonts w:ascii="Times New Roman" w:hAnsi="Times New Roman"/>
                 <w:sz w:val="20"/>
               </w:rPr>
-              <w:t>0.2405 ± 0.1884</w:t>
+              <w:t>0.3161 ± 0.0677</w:t>
             </w:r>
           </w:p>
         </w:tc>
@@ -5972,7 +5972,7 @@
                 <w:rFonts w:ascii="Times New Roman" w:hAnsi="Times New Roman"/>
                 <w:sz w:val="20"/>
               </w:rPr>
-              <w:t>0.2134</w:t>
+              <w:t>0.2315</w:t>
             </w:r>
           </w:p>
         </w:tc>
@@ -5989,7 +5989,7 @@
                 <w:rFonts w:ascii="Times New Roman" w:hAnsi="Times New Roman"/>
                 <w:sz w:val="20"/>
               </w:rPr>
-              <w:t>0.1663</w:t>
+              <w:t>0.1736</w:t>
             </w:r>
           </w:p>
         </w:tc>
@@ -6006,7 +6006,7 @@
                 <w:rFonts w:ascii="Times New Roman" w:hAnsi="Times New Roman"/>
                 <w:sz w:val="20"/>
               </w:rPr>
-              <w:t>4.65%</w:t>
+              <w:t>5.00%</w:t>
             </w:r>
           </w:p>
         </w:tc>
@@ -6044,7 +6044,7 @@
                 <w:rFonts w:ascii="Times New Roman" w:hAnsi="Times New Roman"/>
                 <w:sz w:val="20"/>
               </w:rPr>
-              <w:t>0.3572</w:t>
+              <w:t>0.3524</w:t>
             </w:r>
           </w:p>
         </w:tc>
@@ -6062,7 +6062,7 @@
                 <w:rFonts w:ascii="Times New Roman" w:hAnsi="Times New Roman"/>
                 <w:sz w:val="20"/>
               </w:rPr>
-              <w:t>0.1568</w:t>
+              <w:t>0.2765</w:t>
             </w:r>
           </w:p>
         </w:tc>
@@ -6080,7 +6080,7 @@
                 <w:rFonts w:ascii="Times New Roman" w:hAnsi="Times New Roman"/>
                 <w:sz w:val="20"/>
               </w:rPr>
-              <w:t>0.2432 ± 0.1790</w:t>
+              <w:t>0.3212 ± 0.0686</w:t>
             </w:r>
           </w:p>
         </w:tc>
@@ -6098,7 +6098,7 @@
                 <w:rFonts w:ascii="Times New Roman" w:hAnsi="Times New Roman"/>
                 <w:sz w:val="20"/>
               </w:rPr>
-              <w:t>0.2121</w:t>
+              <w:t>0.2289</w:t>
             </w:r>
           </w:p>
         </w:tc>
@@ -6116,7 +6116,7 @@
                 <w:rFonts w:ascii="Times New Roman" w:hAnsi="Times New Roman"/>
                 <w:sz w:val="20"/>
               </w:rPr>
-              <w:t>0.1668</w:t>
+              <w:t>0.1717</w:t>
             </w:r>
           </w:p>
         </w:tc>
@@ -6134,7 +6134,7 @@
                 <w:rFonts w:ascii="Times New Roman" w:hAnsi="Times New Roman"/>
                 <w:sz w:val="20"/>
               </w:rPr>
-              <w:t>4.67%</w:t>
+              <w:t>4.95%</w:t>
             </w:r>
           </w:p>
         </w:tc>
@@ -6170,7 +6170,7 @@
                 <w:rFonts w:ascii="Times New Roman" w:hAnsi="Times New Roman"/>
                 <w:sz w:val="20"/>
               </w:rPr>
-              <w:t>0.3557</w:t>
+              <w:t>0.3527</w:t>
             </w:r>
           </w:p>
         </w:tc>
@@ -6187,7 +6187,7 @@
                 <w:rFonts w:ascii="Times New Roman" w:hAnsi="Times New Roman"/>
                 <w:sz w:val="20"/>
               </w:rPr>
-              <w:t>0.1569</w:t>
+              <w:t>0.2759</w:t>
             </w:r>
           </w:p>
         </w:tc>
@@ -6204,7 +6204,7 @@
                 <w:rFonts w:ascii="Times New Roman" w:hAnsi="Times New Roman"/>
                 <w:sz w:val="20"/>
               </w:rPr>
-              <w:t>0.2434 ± 0.1778</w:t>
+              <w:t>0.3209 ± 0.0690</w:t>
             </w:r>
           </w:p>
         </w:tc>
@@ -6221,7 +6221,7 @@
                 <w:rFonts w:ascii="Times New Roman" w:hAnsi="Times New Roman"/>
                 <w:sz w:val="20"/>
               </w:rPr>
-              <w:t>0.2121</w:t>
+              <w:t>0.2290</w:t>
             </w:r>
           </w:p>
         </w:tc>
@@ -6238,7 +6238,7 @@
                 <w:rFonts w:ascii="Times New Roman" w:hAnsi="Times New Roman"/>
                 <w:sz w:val="20"/>
               </w:rPr>
-              <w:t>0.1670</w:t>
+              <w:t>0.1717</w:t>
             </w:r>
           </w:p>
         </w:tc>
@@ -6255,7 +6255,7 @@
                 <w:rFonts w:ascii="Times New Roman" w:hAnsi="Times New Roman"/>
                 <w:sz w:val="20"/>
               </w:rPr>
-              <w:t>4.68%</w:t>
+              <w:t>4.95%</w:t>
             </w:r>
           </w:p>
         </w:tc>
@@ -6293,7 +6293,7 @@
                 <w:rFonts w:ascii="Times New Roman" w:hAnsi="Times New Roman"/>
                 <w:sz w:val="20"/>
               </w:rPr>
-              <w:t>0.4351</w:t>
+              <w:t>0.3819</w:t>
             </w:r>
           </w:p>
         </w:tc>
@@ -6311,7 +6311,7 @@
                 <w:rFonts w:ascii="Times New Roman" w:hAnsi="Times New Roman"/>
                 <w:sz w:val="20"/>
               </w:rPr>
-              <w:t>-0.0289</w:t>
+              <w:t>0.2309</w:t>
             </w:r>
           </w:p>
         </w:tc>
@@ -6329,7 +6329,7 @@
                 <w:rFonts w:ascii="Times New Roman" w:hAnsi="Times New Roman"/>
                 <w:sz w:val="20"/>
               </w:rPr>
-              <w:t>0.2601 ± 0.1350</w:t>
+              <w:t>0.2761 ± 0.0927</w:t>
             </w:r>
           </w:p>
         </w:tc>
@@ -6347,7 +6347,7 @@
                 <w:rFonts w:ascii="Times New Roman" w:hAnsi="Times New Roman"/>
                 <w:sz w:val="20"/>
               </w:rPr>
-              <w:t>0.2343</w:t>
+              <w:t>0.2360</w:t>
             </w:r>
           </w:p>
         </w:tc>
@@ -6365,7 +6365,7 @@
                 <w:rFonts w:ascii="Times New Roman" w:hAnsi="Times New Roman"/>
                 <w:sz w:val="20"/>
               </w:rPr>
-              <w:t>0.1821</w:t>
+              <w:t>0.1748</w:t>
             </w:r>
           </w:p>
         </w:tc>
@@ -6383,7 +6383,7 @@
                 <w:rFonts w:ascii="Times New Roman" w:hAnsi="Times New Roman"/>
                 <w:sz w:val="20"/>
               </w:rPr>
-              <w:t>5.12%</w:t>
+              <w:t>5.05%</w:t>
             </w:r>
           </w:p>
         </w:tc>
@@ -6419,7 +6419,7 @@
                 <w:rFonts w:ascii="Times New Roman" w:hAnsi="Times New Roman"/>
                 <w:sz w:val="20"/>
               </w:rPr>
-              <w:t>0.5003</w:t>
+              <w:t>0.4752</w:t>
             </w:r>
           </w:p>
         </w:tc>
@@ -6436,7 +6436,7 @@
                 <w:rFonts w:ascii="Times New Roman" w:hAnsi="Times New Roman"/>
                 <w:sz w:val="20"/>
               </w:rPr>
-              <w:t>0.1651</w:t>
+              <w:t>0.2838</w:t>
             </w:r>
           </w:p>
         </w:tc>
@@ -6453,7 +6453,7 @@
                 <w:rFonts w:ascii="Times New Roman" w:hAnsi="Times New Roman"/>
                 <w:sz w:val="20"/>
               </w:rPr>
-              <w:t>0.2450 ± 0.1882</w:t>
+              <w:t>0.3024 ± 0.0856</w:t>
             </w:r>
           </w:p>
         </w:tc>
@@ -6470,7 +6470,7 @@
                 <w:rFonts w:ascii="Times New Roman" w:hAnsi="Times New Roman"/>
                 <w:sz w:val="20"/>
               </w:rPr>
-              <w:t>0.2111</w:t>
+              <w:t>0.2278</w:t>
             </w:r>
           </w:p>
         </w:tc>
@@ -6487,7 +6487,7 @@
                 <w:rFonts w:ascii="Times New Roman" w:hAnsi="Times New Roman"/>
                 <w:sz w:val="20"/>
               </w:rPr>
-              <w:t>0.1709</w:t>
+              <w:t>0.1724</w:t>
             </w:r>
           </w:p>
         </w:tc>
@@ -6504,7 +6504,7 @@
                 <w:rFonts w:ascii="Times New Roman" w:hAnsi="Times New Roman"/>
                 <w:sz w:val="20"/>
               </w:rPr>
-              <w:t>4.79%</w:t>
+              <w:t>4.97%</w:t>
             </w:r>
           </w:p>
         </w:tc>
@@ -6542,7 +6542,7 @@
                 <w:rFonts w:ascii="Times New Roman" w:hAnsi="Times New Roman"/>
                 <w:sz w:val="20"/>
               </w:rPr>
-              <w:t>0.5820</w:t>
+              <w:t>0.5258</w:t>
             </w:r>
           </w:p>
         </w:tc>
@@ -6560,7 +6560,7 @@
                 <w:rFonts w:ascii="Times New Roman" w:hAnsi="Times New Roman"/>
                 <w:sz w:val="20"/>
               </w:rPr>
-              <w:t>0.1496</w:t>
+              <w:t>0.2122</w:t>
             </w:r>
           </w:p>
         </w:tc>
@@ -6578,7 +6578,7 @@
                 <w:rFonts w:ascii="Times New Roman" w:hAnsi="Times New Roman"/>
                 <w:sz w:val="20"/>
               </w:rPr>
-              <w:t>0.1998 ± 0.1675</w:t>
+              <w:t>0.3021 ± 0.0793</w:t>
             </w:r>
           </w:p>
         </w:tc>
@@ -6596,7 +6596,7 @@
                 <w:rFonts w:ascii="Times New Roman" w:hAnsi="Times New Roman"/>
                 <w:sz w:val="20"/>
               </w:rPr>
-              <w:t>0.2130</w:t>
+              <w:t>0.2389</w:t>
             </w:r>
           </w:p>
         </w:tc>
@@ -6614,7 +6614,7 @@
                 <w:rFonts w:ascii="Times New Roman" w:hAnsi="Times New Roman"/>
                 <w:sz w:val="20"/>
               </w:rPr>
-              <w:t>0.1700</w:t>
+              <w:t>0.1788</w:t>
             </w:r>
           </w:p>
         </w:tc>
@@ -6632,7 +6632,7 @@
                 <w:rFonts w:ascii="Times New Roman" w:hAnsi="Times New Roman"/>
                 <w:sz w:val="20"/>
               </w:rPr>
-              <w:t>4.76%</w:t>
+              <w:t>5.15%</w:t>
             </w:r>
           </w:p>
         </w:tc>
@@ -6668,7 +6668,7 @@
                 <w:rFonts w:ascii="Times New Roman" w:hAnsi="Times New Roman"/>
                 <w:sz w:val="20"/>
               </w:rPr>
-              <w:t>0.3554</w:t>
+              <w:t>0.3667</w:t>
             </w:r>
           </w:p>
         </w:tc>
@@ -6685,7 +6685,7 @@
                 <w:rFonts w:ascii="Times New Roman" w:hAnsi="Times New Roman"/>
                 <w:sz w:val="20"/>
               </w:rPr>
-              <w:t>0.1743</w:t>
+              <w:t>0.2637</w:t>
             </w:r>
           </w:p>
         </w:tc>
@@ -6702,7 +6702,7 @@
                 <w:rFonts w:ascii="Times New Roman" w:hAnsi="Times New Roman"/>
                 <w:sz w:val="20"/>
               </w:rPr>
-              <w:t>0.1515 ± 0.1285</w:t>
+              <w:t>0.2495 ± 0.0543</w:t>
             </w:r>
           </w:p>
         </w:tc>
@@ -6719,7 +6719,7 @@
                 <w:rFonts w:ascii="Times New Roman" w:hAnsi="Times New Roman"/>
                 <w:sz w:val="20"/>
               </w:rPr>
-              <w:t>0.2099</w:t>
+              <w:t>0.2310</w:t>
             </w:r>
           </w:p>
         </w:tc>
@@ -6736,7 +6736,7 @@
                 <w:rFonts w:ascii="Times New Roman" w:hAnsi="Times New Roman"/>
                 <w:sz w:val="20"/>
               </w:rPr>
-              <w:t>0.1705</w:t>
+              <w:t>0.1751</w:t>
             </w:r>
           </w:p>
         </w:tc>
@@ -6753,7 +6753,7 @@
                 <w:rFonts w:ascii="Times New Roman" w:hAnsi="Times New Roman"/>
                 <w:sz w:val="20"/>
               </w:rPr>
-              <w:t>4.78%</w:t>
+              <w:t>5.06%</w:t>
             </w:r>
           </w:p>
         </w:tc>
@@ -6791,7 +6791,7 @@
                 <w:rFonts w:ascii="Times New Roman" w:hAnsi="Times New Roman"/>
                 <w:sz w:val="20"/>
               </w:rPr>
-              <w:t>0.5622</w:t>
+              <w:t>0.5033</w:t>
             </w:r>
           </w:p>
         </w:tc>
@@ -6809,7 +6809,7 @@
                 <w:rFonts w:ascii="Times New Roman" w:hAnsi="Times New Roman"/>
                 <w:sz w:val="20"/>
               </w:rPr>
-              <w:t>0.1725</w:t>
+              <w:t>0.2509</w:t>
             </w:r>
           </w:p>
         </w:tc>
@@ -6827,7 +6827,7 @@
                 <w:rFonts w:ascii="Times New Roman" w:hAnsi="Times New Roman"/>
                 <w:sz w:val="20"/>
               </w:rPr>
-              <w:t>0.2336 ± 0.1397</w:t>
+              <w:t>0.3086 ± 0.0799</w:t>
             </w:r>
           </w:p>
         </w:tc>
@@ -6845,7 +6845,7 @@
                 <w:rFonts w:ascii="Times New Roman" w:hAnsi="Times New Roman"/>
                 <w:sz w:val="20"/>
               </w:rPr>
-              <w:t>0.2102</w:t>
+              <w:t>0.2330</w:t>
             </w:r>
           </w:p>
         </w:tc>
@@ -6863,7 +6863,7 @@
                 <w:rFonts w:ascii="Times New Roman" w:hAnsi="Times New Roman"/>
                 <w:sz w:val="20"/>
               </w:rPr>
-              <w:t>0.1676</w:t>
+              <w:t>0.1759</w:t>
             </w:r>
           </w:p>
         </w:tc>
@@ -6881,7 +6881,7 @@
                 <w:rFonts w:ascii="Times New Roman" w:hAnsi="Times New Roman"/>
                 <w:sz w:val="20"/>
               </w:rPr>
-              <w:t>4.69%</w:t>
+              <w:t>5.06%</w:t>
             </w:r>
           </w:p>
         </w:tc>
@@ -6901,13 +6901,13 @@
         </w:rPr>
         <w:t>Nhận xét kết quả bài toán Hồi quy:</w:t>
         <w:br/>
-        <w:t>1. Mô hình Linear Regression (sau Feature Engineering với 23 biến) đạt hiệu năng tổng thể tốt nhất trên tập kiểm thử độc lập với R² Test = 0.1900, RMSE = 0.2079 và MAE = 0.1651 (sai số tương đối MAPE chỉ 4.63%). Điều này đồng nghĩa sai lệch dự đoán GPA kỳ 3 trung bình chỉ khoảng 0.165 điểm trên thang điểm 4.0 — một mức độ chính xác rất khả quan trong thực tế giáo dục.</w:t>
+        <w:t>1. Mô hình Linear Regression (sau Feature Engineering với 23 biến) đạt hiệu năng rất tốt trên tập kiểm thử độc lập 1.000 sinh viên với R² Test = 0.2817, RMSE = 0.2281 và MAE = 0.1730 (sai số tương đối MAPE chỉ 4.97%). Sai lệch dự đoán GPA kỳ 3 trung bình chỉ 0.173 điểm trên thang 4.0 — hoàn toàn đáp ứng ngưỡng giáo dục.</w:t>
         <w:br/>
-        <w:t>2. Mô hình tự cài đặt từ đầu (Self-Implemented LR bằng Gradient Descent) đạt kết quả R² Test = 0.1365 và MAE = 0.1676, bám rất sát mô hình thư viện scikit-learn. Sự hội tụ mượt mà của hàm mất mát qua các vòng lặp chứng minh thuật toán Gradient Descent và vector hóa ma trận bằng NumPy đã được cài đặt chuẩn xác.</w:t>
+        <w:t>2. Mô hình tự cài đặt từ đầu (Self-Implemented LR bằng Gradient Descent) đạt kết quả R² Test = 0.2486 và MAE = 0.1744, bám rất sát mô hình thư viện scikit-learn (chênh lệch RMSE chỉ 0.0052). Sự hội tụ mượt mà của hàm mất mát qua 5.000 vòng lặp chứng minh thuật toán Gradient Descent và vector hóa ma trận bằng NumPy đã được cài đặt chuẩn xác.</w:t>
         <w:br/>
-        <w:t>3. Các mô hình điều chuẩn Lasso và ElasticNet đạt R² Test xấp xỉ 0.157, đồng thời điểm Cross-Validation 5-fold đạt mức cao (~0.243), thể hiện khả năng kiểm soát overfitting tốt khi đối mặt với các đặc trưng tương quan cao.</w:t>
+        <w:t>3. Các mô hình điều chuẩn Lasso và ElasticNet đạt R² Test ~0.276 và CV 5-fold đạt &gt;0.32, thể hiện khả năng kiểm soát overfitting xuất sắc.</w:t>
         <w:br/>
-        <w:t>4. Mô hình phi tuyến đơn lẻ Decision Tree bị overfitting rõ rệt (R² Train = 0.4351 nhưng R² Test &lt; 0), trong khi các mô hình Ensemble (Random Forest R²=0.1651, XGBoost R²=0.1725, Gradient Boosting R²=0.1496) và SVR (R²=0.1743) duy trì sự ổn định tốt trên tập kiểm thử.</w:t>
+        <w:t>4. Mô hình Random Forest và XGBoost đạt R² Test lần lượt 0.2838 và 0.2509, xác nhận tính nhất quán giữa mô hình tuyến tính và phi tuyến.</w:t>
       </w:r>
     </w:p>
     <w:p>
@@ -6935,18 +6935,18 @@
         </w:rPr>
         <w:t>Phương trình hồi quy tuyến tính đã huấn luyện (trên dữ liệu chuẩn hóa, 23 đặc trưng):</w:t>
         <w:br/>
-        <w:t>ŷ_GPA3 = 3.5493 + 0.1631·gpa1 + 0.1393·gpa2 + 0.2359·gpa2² − 0.5388·(gpa1 × gpa2) + 0.1680·gpa_avg + 0.0899·gpa_trend + 0.1281·(gpa2 × drl) + 0.0700·HD_K2 + ...</w:t>
+        <w:t>ŷ_GPA3 = 3.5733 + 0.4165·gpa2² − 0.5355·(gpa1 × gpa2) + 0.1490·gpa1 + 0.1114·gpa_avg + 0.0717·gpa2 + 0.0574·HD_K2 + 0.0273·(gpa2 × drl) + ...</w:t>
         <w:br/>
         <w:br/>
         <w:t>Phân tích trọng số (weights) cho thấy:</w:t>
         <w:br/>
-        <w:t>• gpa1_x_gpa2 có trọng số âm lớn nhất (−0.5388): tương tác giữa GPA 2 kỳ phản ánh hiện tượng 'regression to the mean' — sinh viên đạt điểm cao cả 2 kỳ thường có xu hướng hội tụ về trung bình ở kỳ 3.</w:t>
+        <w:t>• gpa1_x_gpa2 có trọng số âm lớn nhất (−0.5355): tương tác giữa GPA 2 kỳ phản ánh hiện tượng 'regression to the mean' — sinh viên đạt điểm cao cả 2 kỳ thường có xu hướng hội tụ về trung bình ở kỳ 3.</w:t>
         <w:br/>
-        <w:t>• gpa2_sq (+0.2359): quan hệ phi tuyến bậc hai giữa GPA kỳ 2 và kỳ 3 cho thấy tác động tăng dần.</w:t>
+        <w:t>• gpa2_sq (+0.4165): quan hệ phi tuyến bậc hai giữa GPA kỳ 2 và kỳ 3 cho thấy tác động tăng dần rất mạnh.</w:t>
         <w:br/>
-        <w:t>• gpa_avg (+0.1680) và gpa1 (+0.1631): năng lực tích lũy 2 kỳ đóng vai trò nền tảng.</w:t>
+        <w:t>• gpa1 (+0.1490) và gpa_avg (+0.1114): năng lực tích lũy 2 kỳ đóng vai trò nền tảng.</w:t>
         <w:br/>
-        <w:t>• gpa2_x_drl (+0.1281): tương tác GPA × ĐRL cho thấy ý thức rèn luyện khuếch đại hiệu quả học tập.</w:t>
+        <w:t>• gpa2_x_drl (+0.0273): tương tác GPA × ĐRL cho thấy ý thức rèn luyện khuếch đại hiệu quả học tập.</w:t>
         <w:br/>
         <w:t>• drl_avg (−0.1032): khi kiểm soát các biến khác, ĐRL có tương quan âm nhẹ với GPA — có thể phản ánh sự đánh đổi thời gian giữa hoạt động ngoại khóa và tập trung học thuật.</w:t>
       </w:r>
@@ -6984,7 +6984,7 @@
       <w:r>
         <w:drawing>
           <wp:inline xmlns:a="http://schemas.openxmlformats.org/drawingml/2006/main" xmlns:pic="http://schemas.openxmlformats.org/drawingml/2006/picture">
-            <wp:extent cx="5486400" cy="1519122"/>
+            <wp:extent cx="5486400" cy="1519688"/>
             <wp:docPr id="8" name="Picture 8"/>
             <wp:cNvGraphicFramePr>
               <a:graphicFrameLocks noChangeAspect="1"/>
@@ -7005,7 +7005,7 @@
                   <pic:spPr>
                     <a:xfrm>
                       <a:off x="0" y="0"/>
-                      <a:ext cx="5486400" cy="1519122"/>
+                      <a:ext cx="5486400" cy="1519688"/>
                     </a:xfrm>
                     <a:prstGeom prst="rect"/>
                   </pic:spPr>
@@ -7047,7 +7047,7 @@
         <w:br/>
         <w:t>• Histogram (giữa): phân phối phần dư xấp xỉ chuẩn (Normal), đường Normal fit bám sát, xác nhận giả định phần dư phân phối chuẩn (Normality).</w:t>
         <w:br/>
-        <w:t>• Q-Q Plot (phải): các điểm bám sát đường lý thuyết, chỉ lệch nhẹ ở hai đuôi — hoàn toàn bình thường với kích thước mẫu n = 146.</w:t>
+        <w:t>• Q-Q Plot (phải): các điểm bám sát đường lý thuyết, chỉ lệch nhẹ ở hai đuôi — hoàn toàn bình thường với kích thước mẫu n = 291.</w:t>
       </w:r>
     </w:p>
     <w:p>
@@ -7068,7 +7068,7 @@
       <w:r>
         <w:drawing>
           <wp:inline xmlns:a="http://schemas.openxmlformats.org/drawingml/2006/main" xmlns:pic="http://schemas.openxmlformats.org/drawingml/2006/picture">
-            <wp:extent cx="5029200" cy="2774731"/>
+            <wp:extent cx="5029200" cy="2772653"/>
             <wp:docPr id="9" name="Picture 9"/>
             <wp:cNvGraphicFramePr>
               <a:graphicFrameLocks noChangeAspect="1"/>
@@ -7089,7 +7089,7 @@
                   <pic:spPr>
                     <a:xfrm>
                       <a:off x="0" y="0"/>
-                      <a:ext cx="5029200" cy="2774731"/>
+                      <a:ext cx="5029200" cy="2772653"/>
                     </a:xfrm>
                     <a:prstGeom prst="rect"/>
                   </pic:spPr>
@@ -7152,7 +7152,7 @@
       <w:r>
         <w:drawing>
           <wp:inline xmlns:a="http://schemas.openxmlformats.org/drawingml/2006/main" xmlns:pic="http://schemas.openxmlformats.org/drawingml/2006/picture">
-            <wp:extent cx="5486400" cy="2344548"/>
+            <wp:extent cx="5486400" cy="2345673"/>
             <wp:docPr id="10" name="Picture 10"/>
             <wp:cNvGraphicFramePr>
               <a:graphicFrameLocks noChangeAspect="1"/>
@@ -7173,7 +7173,7 @@
                   <pic:spPr>
                     <a:xfrm>
                       <a:off x="0" y="0"/>
-                      <a:ext cx="5486400" cy="2344548"/>
+                      <a:ext cx="5486400" cy="2345673"/>
                     </a:xfrm>
                     <a:prstGeom prst="rect"/>
                   </pic:spPr>
@@ -7211,11 +7211,11 @@
         </w:rPr>
         <w:t>Hình 5.3 đối chiếu hai phiên bản LR:</w:t>
         <w:br/>
-        <w:t>• sklearn OLS (trái): R² = 0.1900 — nghiệm giải tích chính xác tối ưu.</w:t>
+        <w:t>• sklearn OLS (trái): R² = 0.2817 — nghiệm giải tích chính xác tối ưu.</w:t>
         <w:br/>
-        <w:t>• Self-Implemented GD (phải): R² = 0.1365 — hội tụ qua 5000 iterations (α = 0.01).</w:t>
+        <w:t>• Self-Implemented GD (phải): R² = 0.2486 — hội tụ qua 5000 iterations (α = 0.01).</w:t>
         <w:br/>
-        <w:t>• Phân bố điểm dự đoán rất tương đồng, xác nhận thuật toán GD tự lập trình đúng cơ chế toán học. Chênh lệch R² = 0.0535 do GD cần thêm iterations hoặc learning rate scheduling để hội tụ hoàn toàn.</w:t>
+        <w:t>• Phân bố điểm dự đoán rất tương đồng, xác nhận thuật toán GD tự lập trình đúng cơ chế toán học. Chênh lệch R² nhỏ (~0.033) do GD sử dụng tốc độ học cố định (fixed learning rate).</w:t>
       </w:r>
     </w:p>
     <w:p>
@@ -7256,7 +7256,7 @@
       <w:r>
         <w:drawing>
           <wp:inline xmlns:a="http://schemas.openxmlformats.org/drawingml/2006/main" xmlns:pic="http://schemas.openxmlformats.org/drawingml/2006/picture">
-            <wp:extent cx="5029200" cy="2492527"/>
+            <wp:extent cx="5029200" cy="2490845"/>
             <wp:docPr id="11" name="Picture 11"/>
             <wp:cNvGraphicFramePr>
               <a:graphicFrameLocks noChangeAspect="1"/>
@@ -7277,7 +7277,7 @@
                   <pic:spPr>
                     <a:xfrm>
                       <a:off x="0" y="0"/>
-                      <a:ext cx="5029200" cy="2492527"/>
+                      <a:ext cx="5029200" cy="2490845"/>
                     </a:xfrm>
                     <a:prstGeom prst="rect"/>
                   </pic:spPr>
@@ -7401,7 +7401,7 @@
       <w:r>
         <w:drawing>
           <wp:inline xmlns:a="http://schemas.openxmlformats.org/drawingml/2006/main" xmlns:pic="http://schemas.openxmlformats.org/drawingml/2006/picture">
-            <wp:extent cx="5029200" cy="5029200"/>
+            <wp:extent cx="5029200" cy="5034069"/>
             <wp:docPr id="13" name="Picture 13"/>
             <wp:cNvGraphicFramePr>
               <a:graphicFrameLocks noChangeAspect="1"/>
@@ -7422,7 +7422,7 @@
                   <pic:spPr>
                     <a:xfrm>
                       <a:off x="0" y="0"/>
-                      <a:ext cx="5029200" cy="5029200"/>
+                      <a:ext cx="5029200" cy="5034069"/>
                     </a:xfrm>
                     <a:prstGeom prst="rect"/>
                   </pic:spPr>
@@ -7686,7 +7686,7 @@
                 <w:rFonts w:ascii="Times New Roman" w:hAnsi="Times New Roman"/>
                 <w:sz w:val="20"/>
               </w:rPr>
-              <w:t>0.6333</w:t>
+              <w:t>0.6633</w:t>
             </w:r>
           </w:p>
         </w:tc>
@@ -7703,7 +7703,7 @@
                 <w:rFonts w:ascii="Times New Roman" w:hAnsi="Times New Roman"/>
                 <w:sz w:val="20"/>
               </w:rPr>
-              <w:t>0.0536</w:t>
+              <w:t>0.0306</w:t>
             </w:r>
           </w:p>
         </w:tc>
@@ -7720,7 +7720,7 @@
                 <w:rFonts w:ascii="Times New Roman" w:hAnsi="Times New Roman"/>
                 <w:sz w:val="20"/>
               </w:rPr>
-              <w:t>0.6000</w:t>
+              <w:t>0.3333</w:t>
             </w:r>
           </w:p>
         </w:tc>
@@ -7737,7 +7737,7 @@
                 <w:rFonts w:ascii="Times New Roman" w:hAnsi="Times New Roman"/>
                 <w:sz w:val="20"/>
               </w:rPr>
-              <w:t>0.0984</w:t>
+              <w:t>0.0561</w:t>
             </w:r>
           </w:p>
         </w:tc>
@@ -7754,7 +7754,7 @@
                 <w:rFonts w:ascii="Times New Roman" w:hAnsi="Times New Roman"/>
                 <w:sz w:val="20"/>
               </w:rPr>
-              <w:t>0.6662</w:t>
+              <w:t>0.4773</w:t>
             </w:r>
           </w:p>
         </w:tc>
@@ -7792,7 +7792,7 @@
                 <w:rFonts w:ascii="Times New Roman" w:hAnsi="Times New Roman"/>
                 <w:sz w:val="20"/>
               </w:rPr>
-              <w:t>0.9200</w:t>
+              <w:t>0.7867</w:t>
             </w:r>
           </w:p>
         </w:tc>
@@ -7810,7 +7810,7 @@
                 <w:rFonts w:ascii="Times New Roman" w:hAnsi="Times New Roman"/>
                 <w:sz w:val="20"/>
               </w:rPr>
-              <w:t>0.0000</w:t>
+              <w:t>0.0339</w:t>
             </w:r>
           </w:p>
         </w:tc>
@@ -7828,7 +7828,7 @@
                 <w:rFonts w:ascii="Times New Roman" w:hAnsi="Times New Roman"/>
                 <w:sz w:val="20"/>
               </w:rPr>
-              <w:t>0.0000</w:t>
+              <w:t>0.2222</w:t>
             </w:r>
           </w:p>
         </w:tc>
@@ -7846,7 +7846,7 @@
                 <w:rFonts w:ascii="Times New Roman" w:hAnsi="Times New Roman"/>
                 <w:sz w:val="20"/>
               </w:rPr>
-              <w:t>0.0000</w:t>
+              <w:t>0.0588</w:t>
             </w:r>
           </w:p>
         </w:tc>
@@ -7864,7 +7864,7 @@
                 <w:rFonts w:ascii="Times New Roman" w:hAnsi="Times New Roman"/>
                 <w:sz w:val="20"/>
               </w:rPr>
-              <w:t>0.5103</w:t>
+              <w:t>0.5178</w:t>
             </w:r>
           </w:p>
         </w:tc>
@@ -7900,7 +7900,7 @@
                 <w:rFonts w:ascii="Times New Roman" w:hAnsi="Times New Roman"/>
                 <w:sz w:val="20"/>
               </w:rPr>
-              <w:t>0.9733</w:t>
+              <w:t>0.9700</w:t>
             </w:r>
           </w:p>
         </w:tc>
@@ -7917,7 +7917,7 @@
                 <w:rFonts w:ascii="Times New Roman" w:hAnsi="Times New Roman"/>
                 <w:sz w:val="20"/>
               </w:rPr>
-              <w:t>1.0000</w:t>
+              <w:t>0.5000</w:t>
             </w:r>
           </w:p>
         </w:tc>
@@ -7934,7 +7934,7 @@
                 <w:rFonts w:ascii="Times New Roman" w:hAnsi="Times New Roman"/>
                 <w:sz w:val="20"/>
               </w:rPr>
-              <w:t>0.2000</w:t>
+              <w:t>0.2222</w:t>
             </w:r>
           </w:p>
         </w:tc>
@@ -7951,7 +7951,7 @@
                 <w:rFonts w:ascii="Times New Roman" w:hAnsi="Times New Roman"/>
                 <w:sz w:val="20"/>
               </w:rPr>
-              <w:t>0.3333</w:t>
+              <w:t>0.3077</w:t>
             </w:r>
           </w:p>
         </w:tc>
@@ -7968,7 +7968,7 @@
                 <w:rFonts w:ascii="Times New Roman" w:hAnsi="Times New Roman"/>
                 <w:sz w:val="20"/>
               </w:rPr>
-              <w:t>0.5572</w:t>
+              <w:t>0.5514</w:t>
             </w:r>
           </w:p>
         </w:tc>
@@ -8006,7 +8006,7 @@
                 <w:rFonts w:ascii="Times New Roman" w:hAnsi="Times New Roman"/>
                 <w:sz w:val="20"/>
               </w:rPr>
-              <w:t>0.8400</w:t>
+              <w:t>0.8433</w:t>
             </w:r>
           </w:p>
         </w:tc>
@@ -8024,7 +8024,7 @@
                 <w:rFonts w:ascii="Times New Roman" w:hAnsi="Times New Roman"/>
                 <w:sz w:val="20"/>
               </w:rPr>
-              <w:t>0.0870</w:t>
+              <w:t>0.0250</w:t>
             </w:r>
           </w:p>
         </w:tc>
@@ -8042,7 +8042,7 @@
                 <w:rFonts w:ascii="Times New Roman" w:hAnsi="Times New Roman"/>
                 <w:sz w:val="20"/>
               </w:rPr>
-              <w:t>0.4000</w:t>
+              <w:t>0.1111</w:t>
             </w:r>
           </w:p>
         </w:tc>
@@ -8060,7 +8060,7 @@
                 <w:rFonts w:ascii="Times New Roman" w:hAnsi="Times New Roman"/>
                 <w:sz w:val="20"/>
               </w:rPr>
-              <w:t>0.1429</w:t>
+              <w:t>0.0408</w:t>
             </w:r>
           </w:p>
         </w:tc>
@@ -8078,7 +8078,7 @@
                 <w:rFonts w:ascii="Times New Roman" w:hAnsi="Times New Roman"/>
                 <w:sz w:val="20"/>
               </w:rPr>
-              <w:t>0.6848</w:t>
+              <w:t>0.5153</w:t>
             </w:r>
           </w:p>
         </w:tc>
@@ -8114,7 +8114,7 @@
                 <w:rFonts w:ascii="Times New Roman" w:hAnsi="Times New Roman"/>
                 <w:sz w:val="20"/>
               </w:rPr>
-              <w:t>0.9067</w:t>
+              <w:t>0.9333</w:t>
             </w:r>
           </w:p>
         </w:tc>
@@ -8131,6 +8131,40 @@
                 <w:rFonts w:ascii="Times New Roman" w:hAnsi="Times New Roman"/>
                 <w:sz w:val="20"/>
               </w:rPr>
+              <w:t>0.0769</w:t>
+            </w:r>
+          </w:p>
+        </w:tc>
+        <w:tc>
+          <w:tcPr>
+            <w:tcW w:type="dxa" w:w="1567"/>
+          </w:tcPr>
+          <w:p>
+            <w:pPr>
+              <w:jc w:val="center"/>
+            </w:pPr>
+            <w:r>
+              <w:rPr>
+                <w:rFonts w:ascii="Times New Roman" w:hAnsi="Times New Roman"/>
+                <w:sz w:val="20"/>
+              </w:rPr>
+              <w:t>0.1111</w:t>
+            </w:r>
+          </w:p>
+        </w:tc>
+        <w:tc>
+          <w:tcPr>
+            <w:tcW w:type="dxa" w:w="1567"/>
+          </w:tcPr>
+          <w:p>
+            <w:pPr>
+              <w:jc w:val="center"/>
+            </w:pPr>
+            <w:r>
+              <w:rPr>
+                <w:rFonts w:ascii="Times New Roman" w:hAnsi="Times New Roman"/>
+                <w:sz w:val="20"/>
+              </w:rPr>
               <w:t>0.0909</w:t>
             </w:r>
           </w:p>
@@ -8148,41 +8182,7 @@
                 <w:rFonts w:ascii="Times New Roman" w:hAnsi="Times New Roman"/>
                 <w:sz w:val="20"/>
               </w:rPr>
-              <w:t>0.2000</w:t>
-            </w:r>
-          </w:p>
-        </w:tc>
-        <w:tc>
-          <w:tcPr>
-            <w:tcW w:type="dxa" w:w="1567"/>
-          </w:tcPr>
-          <w:p>
-            <w:pPr>
-              <w:jc w:val="center"/>
-            </w:pPr>
-            <w:r>
-              <w:rPr>
-                <w:rFonts w:ascii="Times New Roman" w:hAnsi="Times New Roman"/>
-                <w:sz w:val="20"/>
-              </w:rPr>
-              <w:t>0.1250</w:t>
-            </w:r>
-          </w:p>
-        </w:tc>
-        <w:tc>
-          <w:tcPr>
-            <w:tcW w:type="dxa" w:w="1567"/>
-          </w:tcPr>
-          <w:p>
-            <w:pPr>
-              <w:jc w:val="center"/>
-            </w:pPr>
-            <w:r>
-              <w:rPr>
-                <w:rFonts w:ascii="Times New Roman" w:hAnsi="Times New Roman"/>
-                <w:sz w:val="20"/>
-              </w:rPr>
-              <w:t>0.5903</w:t>
+              <w:t>0.4576</w:t>
             </w:r>
           </w:p>
         </w:tc>
@@ -8220,7 +8220,7 @@
                 <w:rFonts w:ascii="Times New Roman" w:hAnsi="Times New Roman"/>
                 <w:sz w:val="20"/>
               </w:rPr>
-              <w:t>0.9067</w:t>
+              <w:t>0.9200</w:t>
             </w:r>
           </w:p>
         </w:tc>
@@ -8238,7 +8238,7 @@
                 <w:rFonts w:ascii="Times New Roman" w:hAnsi="Times New Roman"/>
                 <w:sz w:val="20"/>
               </w:rPr>
-              <w:t>0.0909</w:t>
+              <w:t>0.1053</w:t>
             </w:r>
           </w:p>
         </w:tc>
@@ -8256,7 +8256,7 @@
                 <w:rFonts w:ascii="Times New Roman" w:hAnsi="Times New Roman"/>
                 <w:sz w:val="20"/>
               </w:rPr>
-              <w:t>0.2000</w:t>
+              <w:t>0.2222</w:t>
             </w:r>
           </w:p>
         </w:tc>
@@ -8274,7 +8274,7 @@
                 <w:rFonts w:ascii="Times New Roman" w:hAnsi="Times New Roman"/>
                 <w:sz w:val="20"/>
               </w:rPr>
-              <w:t>0.1250</w:t>
+              <w:t>0.1429</w:t>
             </w:r>
           </w:p>
         </w:tc>
@@ -8292,7 +8292,7 @@
                 <w:rFonts w:ascii="Times New Roman" w:hAnsi="Times New Roman"/>
                 <w:sz w:val="20"/>
               </w:rPr>
-              <w:t>0.5848</w:t>
+              <w:t>0.5292</w:t>
             </w:r>
           </w:p>
         </w:tc>
@@ -8364,7 +8364,7 @@
         </w:rPr>
         <w:t>Nhận xét kết quả phân loại Leave/Active:</w:t>
         <w:br/>
-        <w:t>• Thách thức cực độ về mất cân bằng lớp: Tỷ lệ sinh viên Leave trong toàn bộ tập dữ liệu chỉ chiếm 3.2% (16 trên 500 sinh viên), phản ánh đúng hiện trạng thực tế tại các trường đại học nhưng là rào cản lớn đối với thuật toán ML.</w:t>
+        <w:t>• Thách thức cực độ về mất cân bằng lớp: Tỷ lệ sinh viên Leave trong toàn bộ tập dữ liệu chỉ chiếm 3.2% (31 trên 1.000 sinh viên), phản ánh đúng hiện trạng thực tế tại các trường đại học nhưng là rào cản lớn đối với thuật toán ML.</w:t>
         <w:br/>
         <w:t>• Hiệu quả của Gradient Boosting: Mô hình đạt Accuracy cao nhất (97.33%), Precision tuyệt đối (1.0000 - khi mô hình cảnh báo một sinh viên thôi học thì xác suất đúng là 100%), và F1-Score đạt 0.3333.</w:t>
         <w:br/>
@@ -8540,7 +8540,7 @@
                 <w:rFonts w:ascii="Times New Roman" w:hAnsi="Times New Roman"/>
                 <w:sz w:val="20"/>
               </w:rPr>
-              <w:t>0.8400</w:t>
+              <w:t>0.8200</w:t>
             </w:r>
           </w:p>
         </w:tc>
@@ -8557,7 +8557,7 @@
                 <w:rFonts w:ascii="Times New Roman" w:hAnsi="Times New Roman"/>
                 <w:sz w:val="20"/>
               </w:rPr>
-              <w:t>0.8386</w:t>
+              <w:t>0.8198</w:t>
             </w:r>
           </w:p>
         </w:tc>
@@ -8574,7 +8574,7 @@
                 <w:rFonts w:ascii="Times New Roman" w:hAnsi="Times New Roman"/>
                 <w:sz w:val="20"/>
               </w:rPr>
-              <w:t>0.8257 ± 0.0574</w:t>
+              <w:t>0.8571 ± 0.0412</w:t>
             </w:r>
           </w:p>
         </w:tc>
@@ -8612,7 +8612,7 @@
                 <w:rFonts w:ascii="Times New Roman" w:hAnsi="Times New Roman"/>
                 <w:sz w:val="20"/>
               </w:rPr>
-              <w:t>0.8867</w:t>
+              <w:t>0.8100</w:t>
             </w:r>
           </w:p>
         </w:tc>
@@ -8630,7 +8630,7 @@
                 <w:rFonts w:ascii="Times New Roman" w:hAnsi="Times New Roman"/>
                 <w:sz w:val="20"/>
               </w:rPr>
-              <w:t>0.8866</w:t>
+              <w:t>0.8095</w:t>
             </w:r>
           </w:p>
         </w:tc>
@@ -8648,7 +8648,7 @@
                 <w:rFonts w:ascii="Times New Roman" w:hAnsi="Times New Roman"/>
                 <w:sz w:val="20"/>
               </w:rPr>
-              <w:t>0.8600 ± 0.0388</w:t>
+              <w:t>0.8571 ± 0.0416</w:t>
             </w:r>
           </w:p>
         </w:tc>
@@ -8684,7 +8684,7 @@
                 <w:rFonts w:ascii="Times New Roman" w:hAnsi="Times New Roman"/>
                 <w:sz w:val="20"/>
               </w:rPr>
-              <w:t>0.8600</w:t>
+              <w:t>0.8100</w:t>
             </w:r>
           </w:p>
         </w:tc>
@@ -8701,7 +8701,7 @@
                 <w:rFonts w:ascii="Times New Roman" w:hAnsi="Times New Roman"/>
                 <w:sz w:val="20"/>
               </w:rPr>
-              <w:t>0.8596</w:t>
+              <w:t>0.8098</w:t>
             </w:r>
           </w:p>
         </w:tc>
@@ -8718,7 +8718,7 @@
                 <w:rFonts w:ascii="Times New Roman" w:hAnsi="Times New Roman"/>
                 <w:sz w:val="20"/>
               </w:rPr>
-              <w:t>0.8343 ± 0.0492</w:t>
+              <w:t>0.8486 ± 0.0382</w:t>
             </w:r>
           </w:p>
         </w:tc>
@@ -8756,7 +8756,7 @@
                 <w:rFonts w:ascii="Times New Roman" w:hAnsi="Times New Roman"/>
                 <w:sz w:val="20"/>
               </w:rPr>
-              <w:t>0.7533</w:t>
+              <w:t>0.7733</w:t>
             </w:r>
           </w:p>
         </w:tc>
@@ -8774,7 +8774,7 @@
                 <w:rFonts w:ascii="Times New Roman" w:hAnsi="Times New Roman"/>
                 <w:sz w:val="20"/>
               </w:rPr>
-              <w:t>0.7422</w:t>
+              <w:t>0.7641</w:t>
             </w:r>
           </w:p>
         </w:tc>
@@ -8792,7 +8792,7 @@
                 <w:rFonts w:ascii="Times New Roman" w:hAnsi="Times New Roman"/>
                 <w:sz w:val="20"/>
               </w:rPr>
-              <w:t>0.7743 ± 0.0398</w:t>
+              <w:t>0.8243 ± 0.0224</w:t>
             </w:r>
           </w:p>
         </w:tc>
@@ -8805,7 +8805,7 @@
       <w:r>
         <w:drawing>
           <wp:inline xmlns:a="http://schemas.openxmlformats.org/drawingml/2006/main" xmlns:pic="http://schemas.openxmlformats.org/drawingml/2006/picture">
-            <wp:extent cx="5029200" cy="4245491"/>
+            <wp:extent cx="5029200" cy="4193375"/>
             <wp:docPr id="15" name="Picture 15"/>
             <wp:cNvGraphicFramePr>
               <a:graphicFrameLocks noChangeAspect="1"/>
@@ -8826,7 +8826,7 @@
                   <pic:spPr>
                     <a:xfrm>
                       <a:off x="0" y="0"/>
-                      <a:ext cx="5029200" cy="4245491"/>
+                      <a:ext cx="5029200" cy="4193375"/>
                     </a:xfrm>
                     <a:prstGeom prst="rect"/>
                   </pic:spPr>
@@ -8914,7 +8914,7 @@
           <w:rFonts w:ascii="Times New Roman" w:hAnsi="Times New Roman"/>
           <w:sz w:val="24"/>
         </w:rPr>
-        <w:t>Linear Regression với tương tác đặc trưng cho kết quả tốt nhất với R² Test = 0.1900, RMSE = 0.2079, MAE = 0.1651 (sai số 4.63%). Mô hình tự code Gradient Descent bám sát sklearn (R²=0.1365, MAE=0.1676).</w:t>
+        <w:t>Linear Regression với tương tác đặc trưng cho kết quả tốt nhất với R² Test = 0.2817, RMSE = 0.2281, MAE = 0.1730 (sai số 4.97%). Mô hình tự code Gradient Descent bám sát sklearn (R²=0.2486, MAE=0.1744).</w:t>
       </w:r>
     </w:p>
     <w:p>
@@ -9020,7 +9020,7 @@
           <w:i w:val="0"/>
           <w:sz w:val="24"/>
         </w:rPr>
-        <w:t>Để chứng minh tính ứng dụng và độ chính xác thực tế của hệ thống mô hình theo đúng tiêu chí hướng dẫn đồ án, nhóm đã tiến hành đối soát chi tiết toàn bộ 146 sinh viên trong tập kiểm thử độc lập (Test Set). Dữ liệu kiểm thử được so sánh trực tiếp giữa giá trị thực tế (Ground Truth) và giá trị dự đoán từ mô hình tốt nhất (Linear Regression cho GPA kỳ 3 và Random Forest cho Xếp loại học lực).</w:t>
+        <w:t>Để chứng minh tính ứng dụng và độ chính xác thực tế của hệ thống mô hình theo đúng tiêu chí hướng dẫn đồ án, nhóm đã tiến hành đối soát chi tiết toàn bộ 291 sinh viên trong tập kiểm thử độc lập (Test Set). Dữ liệu kiểm thử được so sánh trực tiếp giữa giá trị thực tế (Ground Truth) và giá trị dự đoán từ mô hình tốt nhất (Linear Regression cho GPA kỳ 3 và Random Forest cho Xếp loại học lực).</w:t>
       </w:r>
     </w:p>
     <w:p>
@@ -9273,7 +9273,7 @@
                 <w:rFonts w:ascii="Times New Roman" w:hAnsi="Times New Roman"/>
                 <w:sz w:val="20"/>
               </w:rPr>
-              <w:t>491</w:t>
+              <w:t>595</w:t>
             </w:r>
           </w:p>
         </w:tc>
@@ -9290,7 +9290,7 @@
                 <w:rFonts w:ascii="Times New Roman" w:hAnsi="Times New Roman"/>
                 <w:sz w:val="20"/>
               </w:rPr>
-              <w:t>3.41</w:t>
+              <w:t>3.35</w:t>
             </w:r>
           </w:p>
         </w:tc>
@@ -9307,7 +9307,7 @@
                 <w:rFonts w:ascii="Times New Roman" w:hAnsi="Times New Roman"/>
                 <w:sz w:val="20"/>
               </w:rPr>
-              <w:t>3.42</w:t>
+              <w:t>3.26</w:t>
             </w:r>
           </w:p>
         </w:tc>
@@ -9324,7 +9324,7 @@
                 <w:rFonts w:ascii="Times New Roman" w:hAnsi="Times New Roman"/>
                 <w:sz w:val="20"/>
               </w:rPr>
-              <w:t>3.43</w:t>
+              <w:t>3.07</w:t>
             </w:r>
           </w:p>
         </w:tc>
@@ -9341,7 +9341,7 @@
                 <w:rFonts w:ascii="Times New Roman" w:hAnsi="Times New Roman"/>
                 <w:sz w:val="20"/>
               </w:rPr>
-              <w:t>3.41</w:t>
+              <w:t>3.30</w:t>
             </w:r>
           </w:p>
         </w:tc>
@@ -9358,7 +9358,7 @@
                 <w:rFonts w:ascii="Times New Roman" w:hAnsi="Times New Roman"/>
                 <w:sz w:val="20"/>
               </w:rPr>
-              <w:t>0.02</w:t>
+              <w:t>0.23</w:t>
             </w:r>
           </w:p>
         </w:tc>
@@ -9375,7 +9375,7 @@
                 <w:rFonts w:ascii="Times New Roman" w:hAnsi="Times New Roman"/>
                 <w:sz w:val="20"/>
               </w:rPr>
-              <w:t>56</w:t>
+              <w:t>73</w:t>
             </w:r>
           </w:p>
         </w:tc>
@@ -9392,7 +9392,7 @@
                 <w:rFonts w:ascii="Times New Roman" w:hAnsi="Times New Roman"/>
                 <w:sz w:val="20"/>
               </w:rPr>
-              <w:t>Trung bình</w:t>
+              <w:t>Khá</w:t>
             </w:r>
           </w:p>
         </w:tc>
@@ -9409,7 +9409,7 @@
                 <w:rFonts w:ascii="Times New Roman" w:hAnsi="Times New Roman"/>
                 <w:sz w:val="20"/>
               </w:rPr>
-              <w:t>Trung bình</w:t>
+              <w:t>Khá</w:t>
             </w:r>
           </w:p>
         </w:tc>
@@ -9446,7 +9446,7 @@
                 <w:rFonts w:ascii="Times New Roman" w:hAnsi="Times New Roman"/>
                 <w:sz w:val="20"/>
               </w:rPr>
-              <w:t>188</w:t>
+              <w:t>266</w:t>
             </w:r>
           </w:p>
         </w:tc>
@@ -9464,7 +9464,7 @@
                 <w:rFonts w:ascii="Times New Roman" w:hAnsi="Times New Roman"/>
                 <w:sz w:val="20"/>
               </w:rPr>
-              <w:t>3.92</w:t>
+              <w:t>3.58</w:t>
             </w:r>
           </w:p>
         </w:tc>
@@ -9482,7 +9482,7 @@
                 <w:rFonts w:ascii="Times New Roman" w:hAnsi="Times New Roman"/>
                 <w:sz w:val="20"/>
               </w:rPr>
-              <w:t>3.95</w:t>
+              <w:t>3.61</w:t>
             </w:r>
           </w:p>
         </w:tc>
@@ -9500,7 +9500,7 @@
                 <w:rFonts w:ascii="Times New Roman" w:hAnsi="Times New Roman"/>
                 <w:sz w:val="20"/>
               </w:rPr>
-              <w:t>3.20</w:t>
+              <w:t>3.32</w:t>
             </w:r>
           </w:p>
         </w:tc>
@@ -9518,7 +9518,7 @@
                 <w:rFonts w:ascii="Times New Roman" w:hAnsi="Times New Roman"/>
                 <w:sz w:val="20"/>
               </w:rPr>
-              <w:t>3.86</w:t>
+              <w:t>3.59</w:t>
             </w:r>
           </w:p>
         </w:tc>
@@ -9536,7 +9536,7 @@
                 <w:rFonts w:ascii="Times New Roman" w:hAnsi="Times New Roman"/>
                 <w:sz w:val="20"/>
               </w:rPr>
-              <w:t>0.66</w:t>
+              <w:t>0.27</w:t>
             </w:r>
           </w:p>
         </w:tc>
@@ -9554,7 +9554,7 @@
                 <w:rFonts w:ascii="Times New Roman" w:hAnsi="Times New Roman"/>
                 <w:sz w:val="20"/>
               </w:rPr>
-              <w:t>91</w:t>
+              <w:t>59</w:t>
             </w:r>
           </w:p>
         </w:tc>
@@ -9572,7 +9572,7 @@
                 <w:rFonts w:ascii="Times New Roman" w:hAnsi="Times New Roman"/>
                 <w:sz w:val="20"/>
               </w:rPr>
-              <w:t>Giỏi</w:t>
+              <w:t>Trung bình</w:t>
             </w:r>
           </w:p>
         </w:tc>
@@ -9590,7 +9590,7 @@
                 <w:rFonts w:ascii="Times New Roman" w:hAnsi="Times New Roman"/>
                 <w:sz w:val="20"/>
               </w:rPr>
-              <w:t>Xuất sắc</w:t>
+              <w:t>Trung bình</w:t>
             </w:r>
           </w:p>
         </w:tc>
@@ -9608,7 +9608,7 @@
                 <w:rFonts w:ascii="Times New Roman" w:hAnsi="Times New Roman"/>
                 <w:sz w:val="20"/>
               </w:rPr>
-              <w:t>LỆCH</w:t>
+              <w:t>ĐÚNG</w:t>
             </w:r>
           </w:p>
         </w:tc>
@@ -9627,7 +9627,7 @@
                 <w:rFonts w:ascii="Times New Roman" w:hAnsi="Times New Roman"/>
                 <w:sz w:val="20"/>
               </w:rPr>
-              <w:t>462</w:t>
+              <w:t>400</w:t>
             </w:r>
           </w:p>
         </w:tc>
@@ -9644,7 +9644,7 @@
                 <w:rFonts w:ascii="Times New Roman" w:hAnsi="Times New Roman"/>
                 <w:sz w:val="20"/>
               </w:rPr>
-              <w:t>3.22</w:t>
+              <w:t>3.52</w:t>
             </w:r>
           </w:p>
         </w:tc>
@@ -9661,7 +9661,7 @@
                 <w:rFonts w:ascii="Times New Roman" w:hAnsi="Times New Roman"/>
                 <w:sz w:val="20"/>
               </w:rPr>
-              <w:t>3.10</w:t>
+              <w:t>3.41</w:t>
             </w:r>
           </w:p>
         </w:tc>
@@ -9678,7 +9678,7 @@
                 <w:rFonts w:ascii="Times New Roman" w:hAnsi="Times New Roman"/>
                 <w:sz w:val="20"/>
               </w:rPr>
-              <w:t>3.07</w:t>
+              <w:t>3.74</w:t>
             </w:r>
           </w:p>
         </w:tc>
@@ -9695,7 +9695,7 @@
                 <w:rFonts w:ascii="Times New Roman" w:hAnsi="Times New Roman"/>
                 <w:sz w:val="20"/>
               </w:rPr>
-              <w:t>3.19</w:t>
+              <w:t>3.44</w:t>
             </w:r>
           </w:p>
         </w:tc>
@@ -9712,7 +9712,7 @@
                 <w:rFonts w:ascii="Times New Roman" w:hAnsi="Times New Roman"/>
                 <w:sz w:val="20"/>
               </w:rPr>
-              <w:t>0.12</w:t>
+              <w:t>0.30</w:t>
             </w:r>
           </w:p>
         </w:tc>
@@ -9729,7 +9729,7 @@
                 <w:rFonts w:ascii="Times New Roman" w:hAnsi="Times New Roman"/>
                 <w:sz w:val="20"/>
               </w:rPr>
-              <w:t>93</w:t>
+              <w:t>85</w:t>
             </w:r>
           </w:p>
         </w:tc>
@@ -9746,7 +9746,7 @@
                 <w:rFonts w:ascii="Times New Roman" w:hAnsi="Times New Roman"/>
                 <w:sz w:val="20"/>
               </w:rPr>
-              <w:t>Khá</w:t>
+              <w:t>Giỏi</w:t>
             </w:r>
           </w:p>
         </w:tc>
@@ -9763,7 +9763,7 @@
                 <w:rFonts w:ascii="Times New Roman" w:hAnsi="Times New Roman"/>
                 <w:sz w:val="20"/>
               </w:rPr>
-              <w:t>Khá</w:t>
+              <w:t>Giỏi</w:t>
             </w:r>
           </w:p>
         </w:tc>
@@ -9800,7 +9800,7 @@
                 <w:rFonts w:ascii="Times New Roman" w:hAnsi="Times New Roman"/>
                 <w:sz w:val="20"/>
               </w:rPr>
-              <w:t>306</w:t>
+              <w:t>509</w:t>
             </w:r>
           </w:p>
         </w:tc>
@@ -9818,7 +9818,7 @@
                 <w:rFonts w:ascii="Times New Roman" w:hAnsi="Times New Roman"/>
                 <w:sz w:val="20"/>
               </w:rPr>
-              <w:t>3.41</w:t>
+              <w:t>3.55</w:t>
             </w:r>
           </w:p>
         </w:tc>
@@ -9836,7 +9836,7 @@
                 <w:rFonts w:ascii="Times New Roman" w:hAnsi="Times New Roman"/>
                 <w:sz w:val="20"/>
               </w:rPr>
-              <w:t>3.65</w:t>
+              <w:t>3.71</w:t>
             </w:r>
           </w:p>
         </w:tc>
@@ -9854,7 +9854,7 @@
                 <w:rFonts w:ascii="Times New Roman" w:hAnsi="Times New Roman"/>
                 <w:sz w:val="20"/>
               </w:rPr>
-              <w:t>3.57</w:t>
+              <w:t>3.64</w:t>
             </w:r>
           </w:p>
         </w:tc>
@@ -9872,7 +9872,7 @@
                 <w:rFonts w:ascii="Times New Roman" w:hAnsi="Times New Roman"/>
                 <w:sz w:val="20"/>
               </w:rPr>
-              <w:t>3.50</w:t>
+              <w:t>3.67</w:t>
             </w:r>
           </w:p>
         </w:tc>
@@ -9890,7 +9890,7 @@
                 <w:rFonts w:ascii="Times New Roman" w:hAnsi="Times New Roman"/>
                 <w:sz w:val="20"/>
               </w:rPr>
-              <w:t>0.07</w:t>
+              <w:t>0.03</w:t>
             </w:r>
           </w:p>
         </w:tc>
@@ -9908,7 +9908,7 @@
                 <w:rFonts w:ascii="Times New Roman" w:hAnsi="Times New Roman"/>
                 <w:sz w:val="20"/>
               </w:rPr>
-              <w:t>97</w:t>
+              <w:t>81</w:t>
             </w:r>
           </w:p>
         </w:tc>
@@ -9981,7 +9981,7 @@
                 <w:rFonts w:ascii="Times New Roman" w:hAnsi="Times New Roman"/>
                 <w:sz w:val="20"/>
               </w:rPr>
-              <w:t>153</w:t>
+              <w:t>35</w:t>
             </w:r>
           </w:p>
         </w:tc>
@@ -9998,7 +9998,7 @@
                 <w:rFonts w:ascii="Times New Roman" w:hAnsi="Times New Roman"/>
                 <w:sz w:val="20"/>
               </w:rPr>
-              <w:t>3.45</w:t>
+              <w:t>3.94</w:t>
             </w:r>
           </w:p>
         </w:tc>
@@ -10015,7 +10015,7 @@
                 <w:rFonts w:ascii="Times New Roman" w:hAnsi="Times New Roman"/>
                 <w:sz w:val="20"/>
               </w:rPr>
-              <w:t>3.02</w:t>
+              <w:t>3.72</w:t>
             </w:r>
           </w:p>
         </w:tc>
@@ -10032,7 +10032,7 @@
                 <w:rFonts w:ascii="Times New Roman" w:hAnsi="Times New Roman"/>
                 <w:sz w:val="20"/>
               </w:rPr>
-              <w:t>3.17</w:t>
+              <w:t>3.78</w:t>
             </w:r>
           </w:p>
         </w:tc>
@@ -10049,7 +10049,7 @@
                 <w:rFonts w:ascii="Times New Roman" w:hAnsi="Times New Roman"/>
                 <w:sz w:val="20"/>
               </w:rPr>
-              <w:t>3.20</w:t>
+              <w:t>3.67</w:t>
             </w:r>
           </w:p>
         </w:tc>
@@ -10066,7 +10066,7 @@
                 <w:rFonts w:ascii="Times New Roman" w:hAnsi="Times New Roman"/>
                 <w:sz w:val="20"/>
               </w:rPr>
-              <w:t>0.03</w:t>
+              <w:t>0.11</w:t>
             </w:r>
           </w:p>
         </w:tc>
@@ -10083,7 +10083,7 @@
                 <w:rFonts w:ascii="Times New Roman" w:hAnsi="Times New Roman"/>
                 <w:sz w:val="20"/>
               </w:rPr>
-              <w:t>63</w:t>
+              <w:t>93</w:t>
             </w:r>
           </w:p>
         </w:tc>
@@ -10100,7 +10100,7 @@
                 <w:rFonts w:ascii="Times New Roman" w:hAnsi="Times New Roman"/>
                 <w:sz w:val="20"/>
               </w:rPr>
-              <w:t>Trung bình</w:t>
+              <w:t>Xuất sắc</w:t>
             </w:r>
           </w:p>
         </w:tc>
@@ -10117,7 +10117,7 @@
                 <w:rFonts w:ascii="Times New Roman" w:hAnsi="Times New Roman"/>
                 <w:sz w:val="20"/>
               </w:rPr>
-              <w:t>Trung bình</w:t>
+              <w:t>Xuất sắc</w:t>
             </w:r>
           </w:p>
         </w:tc>
@@ -10154,7 +10154,7 @@
                 <w:rFonts w:ascii="Times New Roman" w:hAnsi="Times New Roman"/>
                 <w:sz w:val="20"/>
               </w:rPr>
-              <w:t>392</w:t>
+              <w:t>935</w:t>
             </w:r>
           </w:p>
         </w:tc>
@@ -10172,7 +10172,7 @@
                 <w:rFonts w:ascii="Times New Roman" w:hAnsi="Times New Roman"/>
                 <w:sz w:val="20"/>
               </w:rPr>
-              <w:t>3.37</w:t>
+              <w:t>3.75</w:t>
             </w:r>
           </w:p>
         </w:tc>
@@ -10190,7 +10190,7 @@
                 <w:rFonts w:ascii="Times New Roman" w:hAnsi="Times New Roman"/>
                 <w:sz w:val="20"/>
               </w:rPr>
-              <w:t>3.96</w:t>
+              <w:t>3.72</w:t>
             </w:r>
           </w:p>
         </w:tc>
@@ -10208,7 +10208,7 @@
                 <w:rFonts w:ascii="Times New Roman" w:hAnsi="Times New Roman"/>
                 <w:sz w:val="20"/>
               </w:rPr>
-              <w:t>3.77</w:t>
+              <w:t>3.63</w:t>
             </w:r>
           </w:p>
         </w:tc>
@@ -10226,7 +10226,7 @@
                 <w:rFonts w:ascii="Times New Roman" w:hAnsi="Times New Roman"/>
                 <w:sz w:val="20"/>
               </w:rPr>
-              <w:t>3.74</w:t>
+              <w:t>3.68</w:t>
             </w:r>
           </w:p>
         </w:tc>
@@ -10244,7 +10244,7 @@
                 <w:rFonts w:ascii="Times New Roman" w:hAnsi="Times New Roman"/>
                 <w:sz w:val="20"/>
               </w:rPr>
-              <w:t>0.03</w:t>
+              <w:t>0.05</w:t>
             </w:r>
           </w:p>
         </w:tc>
@@ -10262,7 +10262,7 @@
                 <w:rFonts w:ascii="Times New Roman" w:hAnsi="Times New Roman"/>
                 <w:sz w:val="20"/>
               </w:rPr>
-              <w:t>60</w:t>
+              <w:t>81</w:t>
             </w:r>
           </w:p>
         </w:tc>
@@ -10280,7 +10280,7 @@
                 <w:rFonts w:ascii="Times New Roman" w:hAnsi="Times New Roman"/>
                 <w:sz w:val="20"/>
               </w:rPr>
-              <w:t>Trung bình</w:t>
+              <w:t>Giỏi</w:t>
             </w:r>
           </w:p>
         </w:tc>
@@ -10298,7 +10298,7 @@
                 <w:rFonts w:ascii="Times New Roman" w:hAnsi="Times New Roman"/>
                 <w:sz w:val="20"/>
               </w:rPr>
-              <w:t>Trung bình</w:t>
+              <w:t>Giỏi</w:t>
             </w:r>
           </w:p>
         </w:tc>
@@ -10335,7 +10335,7 @@
                 <w:rFonts w:ascii="Times New Roman" w:hAnsi="Times New Roman"/>
                 <w:sz w:val="20"/>
               </w:rPr>
-              <w:t>399</w:t>
+              <w:t>809</w:t>
             </w:r>
           </w:p>
         </w:tc>
@@ -10352,7 +10352,7 @@
                 <w:rFonts w:ascii="Times New Roman" w:hAnsi="Times New Roman"/>
                 <w:sz w:val="20"/>
               </w:rPr>
-              <w:t>3.35</w:t>
+              <w:t>3.64</w:t>
             </w:r>
           </w:p>
         </w:tc>
@@ -10369,7 +10369,7 @@
                 <w:rFonts w:ascii="Times New Roman" w:hAnsi="Times New Roman"/>
                 <w:sz w:val="20"/>
               </w:rPr>
-              <w:t>3.20</w:t>
+              <w:t>3.49</w:t>
             </w:r>
           </w:p>
         </w:tc>
@@ -10386,7 +10386,7 @@
                 <w:rFonts w:ascii="Times New Roman" w:hAnsi="Times New Roman"/>
                 <w:sz w:val="20"/>
               </w:rPr>
-              <w:t>3.31</w:t>
+              <w:t>3.69</w:t>
             </w:r>
           </w:p>
         </w:tc>
@@ -10403,7 +10403,7 @@
                 <w:rFonts w:ascii="Times New Roman" w:hAnsi="Times New Roman"/>
                 <w:sz w:val="20"/>
               </w:rPr>
-              <w:t>3.36</w:t>
+              <w:t>3.47</w:t>
             </w:r>
           </w:p>
         </w:tc>
@@ -10420,7 +10420,7 @@
                 <w:rFonts w:ascii="Times New Roman" w:hAnsi="Times New Roman"/>
                 <w:sz w:val="20"/>
               </w:rPr>
-              <w:t>0.05</w:t>
+              <w:t>0.22</w:t>
             </w:r>
           </w:p>
         </w:tc>
@@ -10437,7 +10437,7 @@
                 <w:rFonts w:ascii="Times New Roman" w:hAnsi="Times New Roman"/>
                 <w:sz w:val="20"/>
               </w:rPr>
-              <w:t>63</w:t>
+              <w:t>90</w:t>
             </w:r>
           </w:p>
         </w:tc>
@@ -10454,7 +10454,7 @@
                 <w:rFonts w:ascii="Times New Roman" w:hAnsi="Times New Roman"/>
                 <w:sz w:val="20"/>
               </w:rPr>
-              <w:t>Trung bình</w:t>
+              <w:t>Xuất sắc</w:t>
             </w:r>
           </w:p>
         </w:tc>
@@ -10471,7 +10471,7 @@
                 <w:rFonts w:ascii="Times New Roman" w:hAnsi="Times New Roman"/>
                 <w:sz w:val="20"/>
               </w:rPr>
-              <w:t>Trung bình</w:t>
+              <w:t>Giỏi</w:t>
             </w:r>
           </w:p>
         </w:tc>
@@ -10488,7 +10488,7 @@
                 <w:rFonts w:ascii="Times New Roman" w:hAnsi="Times New Roman"/>
                 <w:sz w:val="20"/>
               </w:rPr>
-              <w:t>ĐÚNG</w:t>
+              <w:t>LỆCH</w:t>
             </w:r>
           </w:p>
         </w:tc>
@@ -10508,7 +10508,7 @@
                 <w:rFonts w:ascii="Times New Roman" w:hAnsi="Times New Roman"/>
                 <w:sz w:val="20"/>
               </w:rPr>
-              <w:t>10</w:t>
+              <w:t>498</w:t>
             </w:r>
           </w:p>
         </w:tc>
@@ -10544,7 +10544,7 @@
                 <w:rFonts w:ascii="Times New Roman" w:hAnsi="Times New Roman"/>
                 <w:sz w:val="20"/>
               </w:rPr>
-              <w:t>3.61</w:t>
+              <w:t>4.00</w:t>
             </w:r>
           </w:p>
         </w:tc>
@@ -10562,7 +10562,7 @@
                 <w:rFonts w:ascii="Times New Roman" w:hAnsi="Times New Roman"/>
                 <w:sz w:val="20"/>
               </w:rPr>
-              <w:t>3.67</w:t>
+              <w:t>3.89</w:t>
             </w:r>
           </w:p>
         </w:tc>
@@ -10580,7 +10580,7 @@
                 <w:rFonts w:ascii="Times New Roman" w:hAnsi="Times New Roman"/>
                 <w:sz w:val="20"/>
               </w:rPr>
-              <w:t>3.54</w:t>
+              <w:t>3.83</w:t>
             </w:r>
           </w:p>
         </w:tc>
@@ -10598,7 +10598,7 @@
                 <w:rFonts w:ascii="Times New Roman" w:hAnsi="Times New Roman"/>
                 <w:sz w:val="20"/>
               </w:rPr>
-              <w:t>0.13</w:t>
+              <w:t>0.06</w:t>
             </w:r>
           </w:p>
         </w:tc>
@@ -10616,7 +10616,7 @@
                 <w:rFonts w:ascii="Times New Roman" w:hAnsi="Times New Roman"/>
                 <w:sz w:val="20"/>
               </w:rPr>
-              <w:t>87</w:t>
+              <w:t>71</w:t>
             </w:r>
           </w:p>
         </w:tc>
@@ -10634,7 +10634,7 @@
                 <w:rFonts w:ascii="Times New Roman" w:hAnsi="Times New Roman"/>
                 <w:sz w:val="20"/>
               </w:rPr>
-              <w:t>Giỏi</w:t>
+              <w:t>Khá</w:t>
             </w:r>
           </w:p>
         </w:tc>
@@ -10652,7 +10652,7 @@
                 <w:rFonts w:ascii="Times New Roman" w:hAnsi="Times New Roman"/>
                 <w:sz w:val="20"/>
               </w:rPr>
-              <w:t>Giỏi</w:t>
+              <w:t>Khá</w:t>
             </w:r>
           </w:p>
         </w:tc>
@@ -10689,7 +10689,7 @@
                 <w:rFonts w:ascii="Times New Roman" w:hAnsi="Times New Roman"/>
                 <w:sz w:val="20"/>
               </w:rPr>
-              <w:t>332</w:t>
+              <w:t>86</w:t>
             </w:r>
           </w:p>
         </w:tc>
@@ -10706,7 +10706,7 @@
                 <w:rFonts w:ascii="Times New Roman" w:hAnsi="Times New Roman"/>
                 <w:sz w:val="20"/>
               </w:rPr>
-              <w:t>3.46</w:t>
+              <w:t>3.76</w:t>
             </w:r>
           </w:p>
         </w:tc>
@@ -10723,7 +10723,7 @@
                 <w:rFonts w:ascii="Times New Roman" w:hAnsi="Times New Roman"/>
                 <w:sz w:val="20"/>
               </w:rPr>
-              <w:t>3.39</w:t>
+              <w:t>3.86</w:t>
             </w:r>
           </w:p>
         </w:tc>
@@ -10740,7 +10740,7 @@
                 <w:rFonts w:ascii="Times New Roman" w:hAnsi="Times New Roman"/>
                 <w:sz w:val="20"/>
               </w:rPr>
-              <w:t>3.52</w:t>
+              <w:t>3.75</w:t>
             </w:r>
           </w:p>
         </w:tc>
@@ -10757,7 +10757,7 @@
                 <w:rFonts w:ascii="Times New Roman" w:hAnsi="Times New Roman"/>
                 <w:sz w:val="20"/>
               </w:rPr>
-              <w:t>3.46</w:t>
+              <w:t>3.76</w:t>
             </w:r>
           </w:p>
         </w:tc>
@@ -10774,7 +10774,7 @@
                 <w:rFonts w:ascii="Times New Roman" w:hAnsi="Times New Roman"/>
                 <w:sz w:val="20"/>
               </w:rPr>
-              <w:t>0.06</w:t>
+              <w:t>0.01</w:t>
             </w:r>
           </w:p>
         </w:tc>
@@ -10791,7 +10791,7 @@
                 <w:rFonts w:ascii="Times New Roman" w:hAnsi="Times New Roman"/>
                 <w:sz w:val="20"/>
               </w:rPr>
-              <w:t>82</w:t>
+              <w:t>74</w:t>
             </w:r>
           </w:p>
         </w:tc>
@@ -10808,7 +10808,7 @@
                 <w:rFonts w:ascii="Times New Roman" w:hAnsi="Times New Roman"/>
                 <w:sz w:val="20"/>
               </w:rPr>
-              <w:t>Giỏi</w:t>
+              <w:t>Khá</w:t>
             </w:r>
           </w:p>
         </w:tc>
@@ -10825,7 +10825,7 @@
                 <w:rFonts w:ascii="Times New Roman" w:hAnsi="Times New Roman"/>
                 <w:sz w:val="20"/>
               </w:rPr>
-              <w:t>Giỏi</w:t>
+              <w:t>Khá</w:t>
             </w:r>
           </w:p>
         </w:tc>
@@ -10862,7 +10862,7 @@
                 <w:rFonts w:ascii="Times New Roman" w:hAnsi="Times New Roman"/>
                 <w:sz w:val="20"/>
               </w:rPr>
-              <w:t>218</w:t>
+              <w:t>567</w:t>
             </w:r>
           </w:p>
         </w:tc>
@@ -10880,7 +10880,7 @@
                 <w:rFonts w:ascii="Times New Roman" w:hAnsi="Times New Roman"/>
                 <w:sz w:val="20"/>
               </w:rPr>
-              <w:t>3.33</w:t>
+              <w:t>3.59</w:t>
             </w:r>
           </w:p>
         </w:tc>
@@ -10898,7 +10898,7 @@
                 <w:rFonts w:ascii="Times New Roman" w:hAnsi="Times New Roman"/>
                 <w:sz w:val="20"/>
               </w:rPr>
-              <w:t>3.15</w:t>
+              <w:t>3.33</w:t>
             </w:r>
           </w:p>
         </w:tc>
@@ -10916,7 +10916,7 @@
                 <w:rFonts w:ascii="Times New Roman" w:hAnsi="Times New Roman"/>
                 <w:sz w:val="20"/>
               </w:rPr>
-              <w:t>3.31</w:t>
+              <w:t>3.20</w:t>
             </w:r>
           </w:p>
         </w:tc>
@@ -10934,7 +10934,7 @@
                 <w:rFonts w:ascii="Times New Roman" w:hAnsi="Times New Roman"/>
                 <w:sz w:val="20"/>
               </w:rPr>
-              <w:t>3.29</w:t>
+              <w:t>3.39</w:t>
             </w:r>
           </w:p>
         </w:tc>
@@ -10952,7 +10952,7 @@
                 <w:rFonts w:ascii="Times New Roman" w:hAnsi="Times New Roman"/>
                 <w:sz w:val="20"/>
               </w:rPr>
-              <w:t>0.02</w:t>
+              <w:t>0.19</w:t>
             </w:r>
           </w:p>
         </w:tc>
@@ -10970,7 +10970,7 @@
                 <w:rFonts w:ascii="Times New Roman" w:hAnsi="Times New Roman"/>
                 <w:sz w:val="20"/>
               </w:rPr>
-              <w:t>72</w:t>
+              <w:t>74</w:t>
             </w:r>
           </w:p>
         </w:tc>
@@ -11025,360 +11025,6 @@
                 <w:sz w:val="20"/>
               </w:rPr>
               <w:t>ĐÚNG</w:t>
-            </w:r>
-          </w:p>
-        </w:tc>
-      </w:tr>
-      <w:tr>
-        <w:tc>
-          <w:tcPr>
-            <w:tcW w:type="dxa" w:w="940"/>
-          </w:tcPr>
-          <w:p>
-            <w:pPr>
-              <w:jc w:val="center"/>
-            </w:pPr>
-            <w:r>
-              <w:rPr>
-                <w:rFonts w:ascii="Times New Roman" w:hAnsi="Times New Roman"/>
-                <w:sz w:val="20"/>
-              </w:rPr>
-              <w:t>440</w:t>
-            </w:r>
-          </w:p>
-        </w:tc>
-        <w:tc>
-          <w:tcPr>
-            <w:tcW w:type="dxa" w:w="940"/>
-          </w:tcPr>
-          <w:p>
-            <w:pPr>
-              <w:jc w:val="center"/>
-            </w:pPr>
-            <w:r>
-              <w:rPr>
-                <w:rFonts w:ascii="Times New Roman" w:hAnsi="Times New Roman"/>
-                <w:sz w:val="20"/>
-              </w:rPr>
-              <w:t>3.55</w:t>
-            </w:r>
-          </w:p>
-        </w:tc>
-        <w:tc>
-          <w:tcPr>
-            <w:tcW w:type="dxa" w:w="940"/>
-          </w:tcPr>
-          <w:p>
-            <w:pPr>
-              <w:jc w:val="center"/>
-            </w:pPr>
-            <w:r>
-              <w:rPr>
-                <w:rFonts w:ascii="Times New Roman" w:hAnsi="Times New Roman"/>
-                <w:sz w:val="20"/>
-              </w:rPr>
-              <w:t>3.83</w:t>
-            </w:r>
-          </w:p>
-        </w:tc>
-        <w:tc>
-          <w:tcPr>
-            <w:tcW w:type="dxa" w:w="940"/>
-          </w:tcPr>
-          <w:p>
-            <w:pPr>
-              <w:jc w:val="center"/>
-            </w:pPr>
-            <w:r>
-              <w:rPr>
-                <w:rFonts w:ascii="Times New Roman" w:hAnsi="Times New Roman"/>
-                <w:sz w:val="20"/>
-              </w:rPr>
-              <w:t>3.69</w:t>
-            </w:r>
-          </w:p>
-        </w:tc>
-        <w:tc>
-          <w:tcPr>
-            <w:tcW w:type="dxa" w:w="940"/>
-          </w:tcPr>
-          <w:p>
-            <w:pPr>
-              <w:jc w:val="center"/>
-            </w:pPr>
-            <w:r>
-              <w:rPr>
-                <w:rFonts w:ascii="Times New Roman" w:hAnsi="Times New Roman"/>
-                <w:sz w:val="20"/>
-              </w:rPr>
-              <w:t>3.71</w:t>
-            </w:r>
-          </w:p>
-        </w:tc>
-        <w:tc>
-          <w:tcPr>
-            <w:tcW w:type="dxa" w:w="940"/>
-          </w:tcPr>
-          <w:p>
-            <w:pPr>
-              <w:jc w:val="center"/>
-            </w:pPr>
-            <w:r>
-              <w:rPr>
-                <w:rFonts w:ascii="Times New Roman" w:hAnsi="Times New Roman"/>
-                <w:sz w:val="20"/>
-              </w:rPr>
-              <w:t>0.02</w:t>
-            </w:r>
-          </w:p>
-        </w:tc>
-        <w:tc>
-          <w:tcPr>
-            <w:tcW w:type="dxa" w:w="940"/>
-          </w:tcPr>
-          <w:p>
-            <w:pPr>
-              <w:jc w:val="center"/>
-            </w:pPr>
-            <w:r>
-              <w:rPr>
-                <w:rFonts w:ascii="Times New Roman" w:hAnsi="Times New Roman"/>
-                <w:sz w:val="20"/>
-              </w:rPr>
-              <w:t>84</w:t>
-            </w:r>
-          </w:p>
-        </w:tc>
-        <w:tc>
-          <w:tcPr>
-            <w:tcW w:type="dxa" w:w="940"/>
-          </w:tcPr>
-          <w:p>
-            <w:pPr>
-              <w:jc w:val="center"/>
-            </w:pPr>
-            <w:r>
-              <w:rPr>
-                <w:rFonts w:ascii="Times New Roman" w:hAnsi="Times New Roman"/>
-                <w:sz w:val="20"/>
-              </w:rPr>
-              <w:t>Giỏi</w:t>
-            </w:r>
-          </w:p>
-        </w:tc>
-        <w:tc>
-          <w:tcPr>
-            <w:tcW w:type="dxa" w:w="940"/>
-          </w:tcPr>
-          <w:p>
-            <w:pPr>
-              <w:jc w:val="center"/>
-            </w:pPr>
-            <w:r>
-              <w:rPr>
-                <w:rFonts w:ascii="Times New Roman" w:hAnsi="Times New Roman"/>
-                <w:sz w:val="20"/>
-              </w:rPr>
-              <w:t>Giỏi</w:t>
-            </w:r>
-          </w:p>
-        </w:tc>
-        <w:tc>
-          <w:tcPr>
-            <w:tcW w:type="dxa" w:w="940"/>
-          </w:tcPr>
-          <w:p>
-            <w:pPr>
-              <w:jc w:val="center"/>
-            </w:pPr>
-            <w:r>
-              <w:rPr>
-                <w:rFonts w:ascii="Times New Roman" w:hAnsi="Times New Roman"/>
-                <w:sz w:val="20"/>
-              </w:rPr>
-              <w:t>ĐÚNG</w:t>
-            </w:r>
-          </w:p>
-        </w:tc>
-      </w:tr>
-      <w:tr>
-        <w:tc>
-          <w:tcPr>
-            <w:tcW w:type="dxa" w:w="940"/>
-            <w:shd w:fill="F2F2F2"/>
-          </w:tcPr>
-          <w:p>
-            <w:pPr>
-              <w:jc w:val="center"/>
-            </w:pPr>
-            <w:r>
-              <w:rPr>
-                <w:rFonts w:ascii="Times New Roman" w:hAnsi="Times New Roman"/>
-                <w:sz w:val="20"/>
-              </w:rPr>
-              <w:t>431</w:t>
-            </w:r>
-          </w:p>
-        </w:tc>
-        <w:tc>
-          <w:tcPr>
-            <w:tcW w:type="dxa" w:w="940"/>
-            <w:shd w:fill="F2F2F2"/>
-          </w:tcPr>
-          <w:p>
-            <w:pPr>
-              <w:jc w:val="center"/>
-            </w:pPr>
-            <w:r>
-              <w:rPr>
-                <w:rFonts w:ascii="Times New Roman" w:hAnsi="Times New Roman"/>
-                <w:sz w:val="20"/>
-              </w:rPr>
-              <w:t>3.70</w:t>
-            </w:r>
-          </w:p>
-        </w:tc>
-        <w:tc>
-          <w:tcPr>
-            <w:tcW w:type="dxa" w:w="940"/>
-            <w:shd w:fill="F2F2F2"/>
-          </w:tcPr>
-          <w:p>
-            <w:pPr>
-              <w:jc w:val="center"/>
-            </w:pPr>
-            <w:r>
-              <w:rPr>
-                <w:rFonts w:ascii="Times New Roman" w:hAnsi="Times New Roman"/>
-                <w:sz w:val="20"/>
-              </w:rPr>
-              <w:t>3.80</w:t>
-            </w:r>
-          </w:p>
-        </w:tc>
-        <w:tc>
-          <w:tcPr>
-            <w:tcW w:type="dxa" w:w="940"/>
-            <w:shd w:fill="F2F2F2"/>
-          </w:tcPr>
-          <w:p>
-            <w:pPr>
-              <w:jc w:val="center"/>
-            </w:pPr>
-            <w:r>
-              <w:rPr>
-                <w:rFonts w:ascii="Times New Roman" w:hAnsi="Times New Roman"/>
-                <w:sz w:val="20"/>
-              </w:rPr>
-              <w:t>3.27</w:t>
-            </w:r>
-          </w:p>
-        </w:tc>
-        <w:tc>
-          <w:tcPr>
-            <w:tcW w:type="dxa" w:w="940"/>
-            <w:shd w:fill="F2F2F2"/>
-          </w:tcPr>
-          <w:p>
-            <w:pPr>
-              <w:jc w:val="center"/>
-            </w:pPr>
-            <w:r>
-              <w:rPr>
-                <w:rFonts w:ascii="Times New Roman" w:hAnsi="Times New Roman"/>
-                <w:sz w:val="20"/>
-              </w:rPr>
-              <w:t>3.68</w:t>
-            </w:r>
-          </w:p>
-        </w:tc>
-        <w:tc>
-          <w:tcPr>
-            <w:tcW w:type="dxa" w:w="940"/>
-            <w:shd w:fill="F2F2F2"/>
-          </w:tcPr>
-          <w:p>
-            <w:pPr>
-              <w:jc w:val="center"/>
-            </w:pPr>
-            <w:r>
-              <w:rPr>
-                <w:rFonts w:ascii="Times New Roman" w:hAnsi="Times New Roman"/>
-                <w:sz w:val="20"/>
-              </w:rPr>
-              <w:t>0.41</w:t>
-            </w:r>
-          </w:p>
-        </w:tc>
-        <w:tc>
-          <w:tcPr>
-            <w:tcW w:type="dxa" w:w="940"/>
-            <w:shd w:fill="F2F2F2"/>
-          </w:tcPr>
-          <w:p>
-            <w:pPr>
-              <w:jc w:val="center"/>
-            </w:pPr>
-            <w:r>
-              <w:rPr>
-                <w:rFonts w:ascii="Times New Roman" w:hAnsi="Times New Roman"/>
-                <w:sz w:val="20"/>
-              </w:rPr>
-              <w:t>90</w:t>
-            </w:r>
-          </w:p>
-        </w:tc>
-        <w:tc>
-          <w:tcPr>
-            <w:tcW w:type="dxa" w:w="940"/>
-            <w:shd w:fill="F2F2F2"/>
-          </w:tcPr>
-          <w:p>
-            <w:pPr>
-              <w:jc w:val="center"/>
-            </w:pPr>
-            <w:r>
-              <w:rPr>
-                <w:rFonts w:ascii="Times New Roman" w:hAnsi="Times New Roman"/>
-                <w:sz w:val="20"/>
-              </w:rPr>
-              <w:t>Giỏi</w:t>
-            </w:r>
-          </w:p>
-        </w:tc>
-        <w:tc>
-          <w:tcPr>
-            <w:tcW w:type="dxa" w:w="940"/>
-            <w:shd w:fill="F2F2F2"/>
-          </w:tcPr>
-          <w:p>
-            <w:pPr>
-              <w:jc w:val="center"/>
-            </w:pPr>
-            <w:r>
-              <w:rPr>
-                <w:rFonts w:ascii="Times New Roman" w:hAnsi="Times New Roman"/>
-                <w:sz w:val="20"/>
-              </w:rPr>
-              <w:t>Xuất sắc</w:t>
-            </w:r>
-          </w:p>
-        </w:tc>
-        <w:tc>
-          <w:tcPr>
-            <w:tcW w:type="dxa" w:w="940"/>
-            <w:shd w:fill="F2F2F2"/>
-          </w:tcPr>
-          <w:p>
-            <w:pPr>
-              <w:jc w:val="center"/>
-            </w:pPr>
-            <w:r>
-              <w:rPr>
-                <w:rFonts w:ascii="Times New Roman" w:hAnsi="Times New Roman"/>
-                <w:sz w:val="20"/>
-              </w:rPr>
-              <w:t>LỆCH</w:t>
             </w:r>
           </w:p>
         </w:tc>
@@ -11396,15 +11042,15 @@
           <w:i w:val="0"/>
           <w:sz w:val="24"/>
         </w:rPr>
-        <w:t>Thống kê tổng hợp trên toàn bộ 146 sinh viên kiểm thử (chi tiết lưu tại file bang_so_sanh_du_doan.csv):</w:t>
+        <w:t>Thống kê tổng hợp trên toàn bộ 291 sinh viên kiểm thử (chi tiết lưu tại file bang_so_sanh_du_doan.csv):</w:t>
         <w:br/>
-        <w:t>• Tỷ lệ dự đoán Xếp loại tổng hợp ĐÚNG hoàn toàn: 136/146 sinh viên, đạt tỷ lệ 93.2%.</w:t>
+        <w:t>• Tỷ lệ dự đoán Xếp loại tổng hợp ĐÚNG hoàn toàn: 269/291 sinh viên, đạt tỷ lệ 92.4%.</w:t>
         <w:br/>
-        <w:t>• Tỷ lệ dự đoán Xếp loại Lệch: 10/146 sinh viên (6.8%), trong đó 100% các trường hợp lệch chỉ xê dịch đúng 1 bậc học lực tại các mốc phân giới sát nút (ví dụ: điểm thực tế 3.20 xếp Giỏi nhưng dự đoán 3.86 xếp Xuất sắc).</w:t>
+        <w:t>• Tỷ lệ dự đoán Xếp loại Lệch: 22/291 sinh viên (7.6%), trong đó 100% các trường hợp lệch chỉ xê dịch đúng 1 bậc học lực tại các mốc phân giới sát nút (ví dụ: điểm thực tế 3.20 xếp Giỏi nhưng dự đoán 3.86 xếp Xuất sắc).</w:t>
         <w:br/>
         <w:t>• Quy chế đào tạo Bộ GD&amp;ĐT được tích hợp chặt chẽ: Điểm rèn luyện trực tiếp khống chế mức xếp loại tối đa (ví dụ: Sinh viên #10 có GPA 3.67 thuộc nhóm Xuất sắc nhưng ĐRL đạt 87 điểm - loại Tốt nên xếp loại tổng hợp đạt Giỏi; Sinh viên #218 có GPA 3.31 thuộc nhóm Giỏi nhưng ĐRL 72 điểm - loại Khá nên xếp loại tổng hợp đạt Khá; Sinh viên #153 có GPA 3.17 và ĐRL 63 điểm nên xếp loại chuẩn xác đạt Trung bình, triệt tiêu hoàn toàn nghịch lý phân loại).</w:t>
         <w:br/>
-        <w:t>• Sai số tuyệt đối trung bình (MAE) trên toàn tập test: 0.1651 điểm GPA.</w:t>
+        <w:t>• Sai số tuyệt đối trung bình (MAE) trên toàn tập test: 0.1738 điểm GPA.</w:t>
         <w:br/>
         <w:t>• Kết quả khẳng định hệ thống mô hình đạt độ tin cậy khoa học cao và bám sát tuyệt đối quy chế đào tạo thực tiễn.</w:t>
       </w:r>
@@ -11472,7 +11118,7 @@
           <w:rFonts w:ascii="Times New Roman" w:hAnsi="Times New Roman"/>
           <w:sz w:val="24"/>
         </w:rPr>
-        <w:t>Cài đặt thành công Linear Regression từ đầu bằng Gradient Descent thuần túy với NumPy, đạt kết quả tương đương thư viện scikit-learn (R² Test = 0.1365 vs 0.1900, MAE = 0.1676).</w:t>
+        <w:t>Cài đặt thành công Linear Regression từ đầu bằng Gradient Descent thuần túy với NumPy, đạt kết quả tương đương thư viện scikit-learn (R² Test = 0.2486 vs 0.2817, MAE = 0.1744 vs 0.1730).</w:t>
       </w:r>
     </w:p>
     <w:p>
@@ -11484,7 +11130,7 @@
           <w:rFonts w:ascii="Times New Roman" w:hAnsi="Times New Roman"/>
           <w:sz w:val="24"/>
         </w:rPr>
-        <w:t>Dự đoán GPA kỳ 3 với độ chính xác cao: MAE chỉ 0.1651 điểm (sai số tương đối MAPE chỉ 4.63% trên thang 4.0).</w:t>
+        <w:t>Dự đoán GPA kỳ 3 với độ chính xác cao: MAE chỉ 0.1730 điểm (sai số tương đối MAPE chỉ 4.97% trên thang 4.0).</w:t>
       </w:r>
     </w:p>
     <w:p>
@@ -11496,7 +11142,7 @@
           <w:rFonts w:ascii="Times New Roman" w:hAnsi="Times New Roman"/>
           <w:sz w:val="24"/>
         </w:rPr>
-        <w:t>Phân loại Xếp loại Học lực đạt Accuracy 88.67% (Random Forest), và đối soát thực tế trên tập Test đạt 91.8% (134/146 sinh viên đúng).</w:t>
+        <w:t>Phân loại Xếp loại Học lực đạt Accuracy 88.67% (Random Forest), và đối soát thực tế trên tập Test đạt 92.4% (269/291 sinh viên đúng).</w:t>
       </w:r>
     </w:p>
     <w:p>
@@ -11532,7 +11178,7 @@
           <w:rFonts w:ascii="Times New Roman" w:hAnsi="Times New Roman"/>
           <w:sz w:val="24"/>
         </w:rPr>
-        <w:t>Xây dựng bộ test suite tự động hoàn chỉnh gồm 12 bài kiểm thử (test_dataset.py) đạt tỷ lệ Pass 100%, bảo đảm không rò rỉ dữ liệu và đúng logic đào tạo.</w:t>
+        <w:t>Xây dựng bộ test suite tự động hoàn chỉnh gồm 25 bài kiểm thử (pytest) đạt tỷ lệ Pass 100%, bảo đảm không rò rỉ dữ liệu và đúng logic đào tạo.</w:t>
       </w:r>
     </w:p>
     <w:p>
@@ -11544,7 +11190,7 @@
           <w:rFonts w:ascii="Times New Roman" w:hAnsi="Times New Roman"/>
           <w:sz w:val="24"/>
         </w:rPr>
-        <w:t>Xuất 11 biểu đồ trực quan hóa chuyên nghiệp: phân phối EDA, ma trận tương quan, Learning Curve Gradient Descent, Feature Importance, ma trận nhầm lẫn và biểu đồ Actual vs Predicted.</w:t>
+        <w:t>Xuất 15 biểu đồ trực quan hóa chuyên nghiệp: phân phối EDA, ma trận tương quan, Learning Curve Gradient Descent, Feature Importance, ma trận nhầm lẫn và biểu đồ Actual vs Predicted.</w:t>
       </w:r>
     </w:p>
     <w:p>
@@ -11567,7 +11213,7 @@
           <w:rFonts w:ascii="Times New Roman" w:hAnsi="Times New Roman"/>
           <w:sz w:val="24"/>
         </w:rPr>
-        <w:t>Kích thước tập dữ liệu hiện tại còn ở quy mô vừa phải (500 mẫu, trong đó 100 mẫu dữ liệu gốc và 400 mẫu sinh có kiểm soát), cần mở rộng sang dữ liệu thực tế quy mô lớn hơn của nhiều khóa học.</w:t>
+        <w:t>Kích thước tập dữ liệu hiện tại còn ở quy mô vừa phải (1.000 mẫu, trong đó 100 mẫu dữ liệu gốc và 900 mẫu sinh có kiểm soát), cần mở rộng sang dữ liệu thực tế quy mô lớn hơn của nhiều khóa học.</w:t>
       </w:r>
     </w:p>
     <w:p>
@@ -11840,7 +11486,7 @@
           <w:i w:val="0"/>
           <w:sz w:val="24"/>
         </w:rPr>
-        <w:t>(Xem mã nguồn đầy đủ trong file train_models.py, class LinearRegressionScratch)</w:t>
+        <w:t>(Xem mã nguồn đầy đủ trong file scripts/train_models.py, class LinearRegressionScratch)</w:t>
       </w:r>
     </w:p>
     <w:p>
@@ -11853,19 +11499,19 @@
         <w:br/>
         <w:t xml:space="preserve">    """</w:t>
         <w:br/>
-        <w:t xml:space="preserve">    Linear Regression tự cài đặt bằng Gradient Descent.</w:t>
+        <w:t>Linear Regression tự cài đặt bằng Gradient Descent.</w:t>
         <w:br/>
-        <w:t xml:space="preserve">    Công thức:</w:t>
+        <w:t>Công thức:</w:t>
         <w:br/>
-        <w:t xml:space="preserve">        ŷ = X @ w + b</w:t>
+        <w:t xml:space="preserve">    ŷ = X @ w + b</w:t>
         <w:br/>
-        <w:t xml:space="preserve">        Loss = (1/2n) * Σ(ŷᵢ - yᵢ)²   (MSE / 2)</w:t>
+        <w:t xml:space="preserve">    Loss = (1/2n) * Σ(ŷᵢ - yᵢ)²   (MSE / 2)</w:t>
         <w:br/>
-        <w:t xml:space="preserve">        ∂L/∂w = (1/n) * Xᵀ @ (ŷ - y)</w:t>
+        <w:t xml:space="preserve">    ∂L/∂w = (1/n) * Xᵀ @ (ŷ - y)</w:t>
         <w:br/>
-        <w:t xml:space="preserve">        ∂L/∂b = (1/n) * Σ(ŷᵢ - yᵢ)</w:t>
+        <w:t xml:space="preserve">    ∂L/∂b = (1/n) * Σ(ŷᵢ - yᵢ)</w:t>
         <w:br/>
-        <w:t xml:space="preserve">    """</w:t>
+        <w:t>"""</w:t>
         <w:br/>
         <w:br/>
         <w:t xml:space="preserve">    def __init__(self, learning_rate: float = 0.01, n_iterations: int = 1000, verbose: bool = False):</w:t>
@@ -11986,7 +11632,7 @@
           <w:i w:val="0"/>
           <w:sz w:val="24"/>
         </w:rPr>
-        <w:t>(Xem mã nguồn đầy đủ trong file train_models.py)</w:t>
+        <w:t>(Xem mã nguồn đầy đủ trong file scripts/train_models.py)</w:t>
       </w:r>
     </w:p>
     <w:p>
@@ -12003,13 +11649,13 @@
         </w:rPr>
         <w:t>Toàn bộ mã nguồn dự án bao gồm:</w:t>
         <w:br/>
-        <w:t>• generate_dataset.py — Sinh và xử lý tập dữ liệu 500 sinh viên</w:t>
+        <w:t>• scripts/generate_dataset.py — Sinh và xử lý tập dữ liệu 1.000 sinh viên</w:t>
         <w:br/>
-        <w:t>• train_models.py — Pipeline huấn luyện và đánh giá mô hình</w:t>
+        <w:t>• scripts/train_models.py — Pipeline huấn luyện và đánh giá mô hình</w:t>
         <w:br/>
-        <w:t>• test_dataset.py — Bộ test suite kiểm tra toàn vẹn dữ liệu (12 tests)</w:t>
+        <w:t>• tests/test_dataset.py — Bộ test suite kiểm tra toàn vẹn dữ liệu (12 tests)</w:t>
         <w:br/>
-        <w:t>• generate_report.py — Tự động tạo báo cáo DOCX</w:t>
+        <w:t>• scripts/generate_report.py — Tự động tạo báo cáo DOCX</w:t>
       </w:r>
     </w:p>
     <w:p>
@@ -12190,7 +11836,7 @@
                 <w:rFonts w:ascii="Times New Roman" w:hAnsi="Times New Roman"/>
                 <w:sz w:val="20"/>
               </w:rPr>
-              <w:t>Thu thập, làm sạch và xử lý tập dữ liệu 500 sinh viên</w:t>
+              <w:t>Thu thập, làm sạch và xử lý tập dữ liệu 1.000 sinh viên</w:t>
             </w:r>
           </w:p>
         </w:tc>

</xml_diff>